<commit_message>
Updated with author contributions
</commit_message>
<xml_diff>
--- a/index.docx
+++ b/index.docx
@@ -23,7 +23,7 @@
         <w:pStyle w:val="Date"/>
       </w:pPr>
       <w:r>
-        <w:t xml:space="preserve">January 2026</w:t>
+        <w:t xml:space="preserve">March 2026</w:t>
       </w:r>
     </w:p>
     <w:bookmarkStart w:id="21" w:name="author-notes"/>
@@ -455,17 +455,7 @@
         <w:pStyle w:val="BodyText"/>
       </w:pPr>
       <w:r>
-        <w:t xml:space="preserve">Watershed land use reflects the long history of development as well as the low population density (Figure 1). Based on the 2021 National Land Cover Database, the major land use remains forest (45%), although forest types now include deciduous, evergreen, mixed, and shrub/scrub systems. The second most common land use is pasture (42%) with predominant agricultural effects stemming from confined animal feeding operations like poultry houses. Urban land uses are isolated (7%), and residents rely primarily on septic tanks for wastewater management. Road networks are also limited, although a significant extent of unpaved roads may be important sediment sources (</w:t>
-      </w:r>
-      <w:r>
-        <w:rPr>
-          <w:b/>
-          <w:bCs/>
-        </w:rPr>
-        <w:t xml:space="preserve">XXX</w:t>
-      </w:r>
-      <w:r>
-        <w:t xml:space="preserve">, personal communication). Oil extraction using hydraulic fracturing (i.e.,</w:t>
+        <w:t xml:space="preserve">Watershed land use reflects the long history of development as well as the low population density (Figure 1). Based on the 2021 National Land Cover Database, the major land use remains forest (45%), although forest types now include deciduous, evergreen, mixed, and shrub/scrub systems. The second most common land use is pasture (42%) with predominant agricultural effects stemming from confined animal feeding operations like poultry houses. Urban land uses are isolated (7%), and residents rely primarily on septic tanks for wastewater management. Road networks are also limited, although a significant extent of unpaved roads may be important sediment sources. Oil extraction using hydraulic fracturing (i.e.,</w:t>
       </w:r>
       <w:r>
         <w:t xml:space="preserve"> </w:t>
@@ -559,24 +549,6 @@
         <w:pStyle w:val="FirstParagraph"/>
       </w:pPr>
       <w:r>
-        <w:t xml:space="preserve">(</w:t>
-      </w:r>
-      <w:r>
-        <w:rPr>
-          <w:b/>
-          <w:bCs/>
-        </w:rPr>
-        <w:t xml:space="preserve">Looking for Michael and Julianna’s help here</w:t>
-      </w:r>
-      <w:r>
-        <w:t xml:space="preserve">).</w:t>
-      </w:r>
-    </w:p>
-    <w:p>
-      <w:pPr>
-        <w:pStyle w:val="BodyText"/>
-      </w:pPr>
-      <w:r>
         <w:t xml:space="preserve">This study was conducted under a partnership between the U.S. Army Corps of Engineers and the Conway Corporation to develop a long-term vision for the watershed, identify preliminary management actions, and align opportunities with potential funding sources (e.g., USEPA’s 319 program, USDA’s Conservation Reserve Program, state grants). The study was conducted under an 18 month timeline with oversight from these entities as well as a technical advisory body with representatives from other federal and state agencies. While broader watershed goals were considered, the primary motivations center on the missions of these entities.</w:t>
       </w:r>
     </w:p>
@@ -1020,24 +992,6 @@
         <w:pStyle w:val="FirstParagraph"/>
       </w:pPr>
       <w:r>
-        <w:t xml:space="preserve">(</w:t>
-      </w:r>
-      <w:r>
-        <w:rPr>
-          <w:b/>
-          <w:bCs/>
-        </w:rPr>
-        <w:t xml:space="preserve">Looking for Maya’s help here.</w:t>
-      </w:r>
-      <w:r>
-        <w:t xml:space="preserve">)</w:t>
-      </w:r>
-    </w:p>
-    <w:p>
-      <w:pPr>
-        <w:pStyle w:val="BodyText"/>
-      </w:pPr>
-      <w:r>
         <w:t xml:space="preserve">A numeric target or threshold for each indicator helps judge the relative success of watershed management actions in achieving the objectives. However, numerical targets are challenging to develop without technical information on feasibility in a specific geography. Initial targets were developed qualitatively and then confirmed using simple modeling exercises.</w:t>
       </w:r>
     </w:p>
@@ -1054,7 +1008,7 @@
         <w:pStyle w:val="BodyText"/>
       </w:pPr>
       <w:r>
-        <w:t xml:space="preserve">These targets were then analyzed using the EPA’s Pollutant Load Estimation Tool (PLET) to estimate removal efficiency of three scenarios of best management practices (BMPs) at the watershed-scale. PLET is a spatially lumped calculator treating the entire watershed as one analytical domain. Land cover serves as the primary driver of removal efficiency in PLET, and the National Land Cover Data Set (NLCD) from 2021 was used to parameterize the model. This model provides a low level of effort for preliminary exploration of feasibility.</w:t>
+        <w:t xml:space="preserve">These targets were then analyzed using the EPA’s Pollutant Load Estimation Tool (PLET) to estimate removal efficiency of three scenarios of best management practices (BMPs) at the watershed-scale. PLET is a spatially lumped calculator treating the entire watershed as one analytical domain. Land cover serves as the primary driver of nutrient loading in PLET, and the National Land Cover Data Set (NLCD) from 2021 was used to parameterize the model. This model provides a low level of effort for preliminary exploration of feasibility.</w:t>
       </w:r>
     </w:p>
     <w:p>
@@ -1147,24 +1101,6 @@
         <w:pStyle w:val="FirstParagraph"/>
       </w:pPr>
       <w:r>
-        <w:t xml:space="preserve">(</w:t>
-      </w:r>
-      <w:r>
-        <w:rPr>
-          <w:b/>
-          <w:bCs/>
-        </w:rPr>
-        <w:t xml:space="preserve">Looking for Drew’s help here, particularly with adding goodness-of-fit statistics for model calibration.</w:t>
-      </w:r>
-      <w:r>
-        <w:t xml:space="preserve">)</w:t>
-      </w:r>
-    </w:p>
-    <w:p>
-      <w:pPr>
-        <w:pStyle w:val="BodyText"/>
-      </w:pPr>
-      <w:r>
         <w:t xml:space="preserve">As described, watershed management goals centered on sediment, nitrogen, and phosphorous. Water quality data were unavailable throughout the watershed at sufficient spatial or temporal resolution to identify sources and understanding the effects of management actions. Therefore, a spatially distributed watershed model was developed to inform watershed planning. When calibrated against historical data, watershed models can help reconstruct historical change in a basin (Yan and Edwards 2013) as well as forecast future conditions such as management (Davis 2012, Hart 2014), land use (McKay et al. 2019), or climate scenarios (Sharif et al. 2007).</w:t>
       </w:r>
     </w:p>
@@ -1173,131 +1109,595 @@
         <w:pStyle w:val="BodyText"/>
       </w:pPr>
       <w:r>
-        <w:t xml:space="preserve">HSPF (Hydrologic Simulation Program – Fortran) (Bicknell et al., 2001) was used to simulate watershed hydrology as well as sediment and nutrient dynamics. The HSPF model is included in the EPA BASINS suite of tools (US EPA, 2025) and is frequently used in watershed studies nationwide (e.g., McKay et al. 2019). Furthermore, prior HSPF models have been used in this watershed to estimate effects of land use change from oil and gas development on water quality outcomes (Hart 2014).</w:t>
-      </w:r>
-      <w:r>
-        <w:t xml:space="preserve"> </w:t>
-      </w:r>
-      <w:r>
-        <w:rPr>
-          <w:b/>
-          <w:bCs/>
-        </w:rPr>
-        <w:t xml:space="preserve">Add a sentence or two here about parameterization, number of catchments, average catchment size, etc.</w:t>
-      </w:r>
-    </w:p>
-    <w:p>
-      <w:pPr>
-        <w:pStyle w:val="BodyText"/>
-      </w:pPr>
-      <w:r>
-        <w:t xml:space="preserve">The HSPF model was calibrated for the single streamflow monitoring site in the watershed (USGS Gage Number 07261090), based on a period of record from 2009-2023. No water quality data were available at this site, and only hydrologic calibration was possible. The HSPF model successfully reproduced measured flow patterns, including daily hydrographs (</w:t>
-      </w:r>
-      <w:r>
-        <w:rPr>
-          <w:b/>
-          <w:bCs/>
-        </w:rPr>
-        <w:t xml:space="preserve">GOF=XX</w:t>
-      </w:r>
-      <w:r>
-        <w:t xml:space="preserve">), monthly averages (</w:t>
-      </w:r>
-      <w:r>
-        <w:rPr>
-          <w:b/>
-          <w:bCs/>
-        </w:rPr>
-        <w:t xml:space="preserve">GOF=XX</w:t>
-      </w:r>
-      <w:r>
-        <w:t xml:space="preserve">), cumulative volumes (</w:t>
-      </w:r>
-      <w:r>
-        <w:rPr>
-          <w:b/>
-          <w:bCs/>
-        </w:rPr>
-        <w:t xml:space="preserve">GOF=XX</w:t>
-      </w:r>
-      <w:r>
-        <w:t xml:space="preserve">), and flow duration distributions (</w:t>
-      </w:r>
-      <w:r>
-        <w:rPr>
-          <w:b/>
-          <w:bCs/>
-        </w:rPr>
-        <w:t xml:space="preserve">GOF=XX</w:t>
-      </w:r>
-      <w:r>
-        <w:t xml:space="preserve">). Model performance metrics met all major calibration targets for storm peaks, storm volumes, seasonal runoff, recession rates, and total flow volume (i.e.,</w:t>
-      </w:r>
-      <w:r>
-        <w:t xml:space="preserve"> </w:t>
-      </w:r>
-      <w:r>
-        <w:rPr>
-          <w:b/>
-          <w:bCs/>
-        </w:rPr>
-        <w:t xml:space="preserve">GOF&gt;XX for all metrics</w:t>
-      </w:r>
-      <w:r>
-        <w:t xml:space="preserve">). Models showed greater error rates in low and high flow ranges, but these were deemed acceptable given the study’s focus on long-term trends aggregated at decadal scales.</w:t>
-      </w:r>
-    </w:p>
-    <w:p>
-      <w:pPr>
-        <w:pStyle w:val="BodyText"/>
-      </w:pPr>
-      <w:r>
-        <w:t xml:space="preserve">Following calibration, models were applied to estimate sediment, nitrogen, and phosphorous yield in each of the</w:t>
-      </w:r>
-      <w:r>
-        <w:t xml:space="preserve"> </w:t>
-      </w:r>
-      <w:r>
-        <w:rPr>
-          <w:b/>
-          <w:bCs/>
-        </w:rPr>
-        <w:t xml:space="preserve">XX</w:t>
-      </w:r>
-      <w:r>
-        <w:t xml:space="preserve"> </w:t>
-      </w:r>
-      <w:r>
-        <w:t xml:space="preserve">catchments. Sediment was simulated over the five year period from 2010-2015 and nutrients were simulated for the 11 years spanning 2013-2024.</w:t>
-      </w:r>
-      <w:r>
-        <w:t xml:space="preserve"> </w:t>
-      </w:r>
-      <w:r>
-        <w:rPr>
-          <w:b/>
-          <w:bCs/>
-        </w:rPr>
-        <w:t xml:space="preserve">Need a statement justifying the different periods of analysis.</w:t>
-      </w:r>
-      <w:r>
-        <w:t xml:space="preserve"> </w:t>
-      </w:r>
-      <w:r>
-        <w:t xml:space="preserve">Modeled yield was aggregated temporally over the simulation period (6 years and 12 years for sediment and N/P, respectively). While 60 sub-catchments provided greater predictive accuracy in HSPF, this spatial resolution was considered finer scale (</w:t>
-      </w:r>
-      <w:r>
-        <w:rPr>
-          <w:b/>
-          <w:bCs/>
-        </w:rPr>
-        <w:t xml:space="preserve">XXX</w:t>
-      </w:r>
-      <w:r>
-        <w:t xml:space="preserve"> </w:t>
-      </w:r>
-      <w:r>
-        <w:t xml:space="preserve">mi</w:t>
+        <w:t xml:space="preserve">The HSPF (Hydrologic Simulation Program – Fortran) watershed model (Bicknell et al., 2001) was used to simulate watershed hydrology as well as sediment and nutrient dynamics. Prior HSPF models have been used in this watershed to estimate effects of land use change from oil and gas development on water quality outcomes (Hart 2014). For this study, the watershed was delineated to 67 catchments which averaged 126 acres.</w:t>
+      </w:r>
+    </w:p>
+    <w:p>
+      <w:pPr>
+        <w:pStyle w:val="BodyText"/>
+      </w:pPr>
+      <w:r>
+        <w:t xml:space="preserve">Hydrologic calibration of the HSPF model was performed using continuous daily streamflow data from the USGS gaging station on Cypress Creek (USGS 07261090). Model parameters governing surface runoff, infiltration, interflow, and groundwater recession were adjusted to reproduce observed flow magnitude, timing, and distribution across low‑, median‑, and high‑flow regimes. Calibration emphasized accurate representation of total water balance, storm response, seasonal variability, and flow duration characteristics, with particular attention to baseflow contributions given the intermittent nature of the stream and greater uncertainty at very low flows. Model performance was evaluated using standard HSPF Expert System metrics (Donigian, 2000), including errors in total volume, high‑ and low‑flow statistics, storm volumes, seasonal runoff, and recession behavior (Table 2). Graphical comparisons of observed and simulated flows, flow duration curves, and cumulative discharge demonstrated good agreement across the calibration period, indicating that the model reliably reproduced dominant hydrologic processes controlling runoff generation and streamflow routing within the watershed.</w:t>
+      </w:r>
+    </w:p>
+    <w:p>
+      <w:pPr>
+        <w:pStyle w:val="TableCaption"/>
+      </w:pPr>
+      <w:r>
+        <w:t xml:space="preserve">Table 2. HSPF hydrologic model performance metrics.</w:t>
+      </w:r>
+    </w:p>
+    <w:tbl>
+      <w:tblPr>
+        <w:tblStyle w:val="Table"/>
+        <w:tblW w:type="auto" w:w="0"/>
+        <w:tblLook w:firstRow="1" w:lastRow="0" w:firstColumn="0" w:lastColumn="0" w:noHBand="0" w:noVBand="0" w:val="0020"/>
+        <w:tblCaption w:val="Table 2. HSPF hydrologic model performance metrics."/>
+      </w:tblPr>
+      <w:tblGrid>
+        <w:gridCol w:w="2640"/>
+        <w:gridCol w:w="2640"/>
+        <w:gridCol w:w="2640"/>
+      </w:tblGrid>
+      <w:tr>
+        <w:trPr>
+          <w:tblHeader w:val="on"/>
+        </w:trPr>
+        <w:tc>
+          <w:tcPr/>
+          <w:p>
+            <w:pPr>
+              <w:pStyle w:val="Compact"/>
+              <w:jc w:val="center"/>
+            </w:pPr>
+            <w:r>
+              <w:t xml:space="preserve">Criteria</w:t>
+            </w:r>
+          </w:p>
+        </w:tc>
+        <w:tc>
+          <w:tcPr/>
+          <w:p>
+            <w:pPr>
+              <w:pStyle w:val="Compact"/>
+              <w:jc w:val="center"/>
+            </w:pPr>
+            <w:r>
+              <w:t xml:space="preserve">Calibration Target</w:t>
+            </w:r>
+          </w:p>
+        </w:tc>
+        <w:tc>
+          <w:tcPr/>
+          <w:p>
+            <w:pPr>
+              <w:pStyle w:val="Compact"/>
+              <w:jc w:val="center"/>
+            </w:pPr>
+            <w:r>
+              <w:t xml:space="preserve">Model Error (%)</w:t>
+            </w:r>
+          </w:p>
+        </w:tc>
+      </w:tr>
+      <w:tr>
+        <w:tc>
+          <w:tcPr/>
+          <w:p>
+            <w:pPr>
+              <w:pStyle w:val="Compact"/>
+              <w:jc w:val="center"/>
+            </w:pPr>
+            <w:r>
+              <w:t xml:space="preserve">Total volume</w:t>
+            </w:r>
+          </w:p>
+        </w:tc>
+        <w:tc>
+          <w:tcPr/>
+          <w:p>
+            <w:pPr>
+              <w:pStyle w:val="Compact"/>
+              <w:jc w:val="center"/>
+            </w:pPr>
+            <w:r>
+              <w:t xml:space="preserve">10</w:t>
+            </w:r>
+          </w:p>
+        </w:tc>
+        <w:tc>
+          <w:tcPr/>
+          <w:p>
+            <w:pPr>
+              <w:pStyle w:val="Compact"/>
+              <w:jc w:val="center"/>
+            </w:pPr>
+            <w:r>
+              <w:t xml:space="preserve">-4.6</w:t>
+            </w:r>
+          </w:p>
+        </w:tc>
+      </w:tr>
+      <w:tr>
+        <w:tc>
+          <w:tcPr/>
+          <w:p>
+            <w:pPr>
+              <w:pStyle w:val="Compact"/>
+              <w:jc w:val="center"/>
+            </w:pPr>
+            <w:r>
+              <w:t xml:space="preserve">Highest 10% of flows</w:t>
+            </w:r>
+          </w:p>
+        </w:tc>
+        <w:tc>
+          <w:tcPr/>
+          <w:p>
+            <w:pPr>
+              <w:pStyle w:val="Compact"/>
+              <w:jc w:val="center"/>
+            </w:pPr>
+            <w:r>
+              <w:t xml:space="preserve">15</w:t>
+            </w:r>
+          </w:p>
+        </w:tc>
+        <w:tc>
+          <w:tcPr/>
+          <w:p>
+            <w:pPr>
+              <w:pStyle w:val="Compact"/>
+              <w:jc w:val="center"/>
+            </w:pPr>
+            <w:r>
+              <w:t xml:space="preserve">6.1</w:t>
+            </w:r>
+          </w:p>
+        </w:tc>
+      </w:tr>
+      <w:tr>
+        <w:tc>
+          <w:tcPr/>
+          <w:p>
+            <w:pPr>
+              <w:pStyle w:val="Compact"/>
+              <w:jc w:val="center"/>
+            </w:pPr>
+            <w:r>
+              <w:t xml:space="preserve">Highest 25% of flows</w:t>
+            </w:r>
+          </w:p>
+        </w:tc>
+        <w:tc>
+          <w:tcPr/>
+          <w:p>
+            <w:pPr>
+              <w:pStyle w:val="Compact"/>
+              <w:jc w:val="center"/>
+            </w:pPr>
+            <w:r>
+              <w:t xml:space="preserve">10</w:t>
+            </w:r>
+          </w:p>
+        </w:tc>
+        <w:tc>
+          <w:tcPr/>
+          <w:p>
+            <w:pPr>
+              <w:pStyle w:val="Compact"/>
+              <w:jc w:val="center"/>
+            </w:pPr>
+            <w:r>
+              <w:t xml:space="preserve">-2.8</w:t>
+            </w:r>
+          </w:p>
+        </w:tc>
+      </w:tr>
+      <w:tr>
+        <w:tc>
+          <w:tcPr/>
+          <w:p>
+            <w:pPr>
+              <w:pStyle w:val="Compact"/>
+              <w:jc w:val="center"/>
+            </w:pPr>
+            <w:r>
+              <w:t xml:space="preserve">Highest 50% of flows</w:t>
+            </w:r>
+          </w:p>
+        </w:tc>
+        <w:tc>
+          <w:tcPr/>
+          <w:p>
+            <w:pPr>
+              <w:pStyle w:val="Compact"/>
+              <w:jc w:val="center"/>
+            </w:pPr>
+            <w:r>
+              <w:t xml:space="preserve">10</w:t>
+            </w:r>
+          </w:p>
+        </w:tc>
+        <w:tc>
+          <w:tcPr/>
+          <w:p>
+            <w:pPr>
+              <w:pStyle w:val="Compact"/>
+              <w:jc w:val="center"/>
+            </w:pPr>
+            <w:r>
+              <w:t xml:space="preserve">-5.1</w:t>
+            </w:r>
+          </w:p>
+        </w:tc>
+      </w:tr>
+      <w:tr>
+        <w:tc>
+          <w:tcPr/>
+          <w:p>
+            <w:pPr>
+              <w:pStyle w:val="Compact"/>
+              <w:jc w:val="center"/>
+            </w:pPr>
+            <w:r>
+              <w:t xml:space="preserve">Lowest 50% of flows</w:t>
+            </w:r>
+          </w:p>
+        </w:tc>
+        <w:tc>
+          <w:tcPr/>
+          <w:p>
+            <w:pPr>
+              <w:pStyle w:val="Compact"/>
+              <w:jc w:val="center"/>
+            </w:pPr>
+            <w:r>
+              <w:t xml:space="preserve">10</w:t>
+            </w:r>
+          </w:p>
+        </w:tc>
+        <w:tc>
+          <w:tcPr/>
+          <w:p>
+            <w:pPr>
+              <w:pStyle w:val="Compact"/>
+              <w:jc w:val="center"/>
+            </w:pPr>
+            <w:r>
+              <w:t xml:space="preserve">15</w:t>
+            </w:r>
+          </w:p>
+        </w:tc>
+      </w:tr>
+      <w:tr>
+        <w:tc>
+          <w:tcPr/>
+          <w:p>
+            <w:pPr>
+              <w:pStyle w:val="Compact"/>
+              <w:jc w:val="center"/>
+            </w:pPr>
+            <w:r>
+              <w:t xml:space="preserve">Lowest 25% of flows</w:t>
+            </w:r>
+          </w:p>
+        </w:tc>
+        <w:tc>
+          <w:tcPr/>
+          <w:p>
+            <w:pPr>
+              <w:pStyle w:val="Compact"/>
+              <w:jc w:val="center"/>
+            </w:pPr>
+            <w:r>
+              <w:t xml:space="preserve">15</w:t>
+            </w:r>
+          </w:p>
+        </w:tc>
+        <w:tc>
+          <w:tcPr/>
+          <w:p>
+            <w:pPr>
+              <w:pStyle w:val="Compact"/>
+              <w:jc w:val="center"/>
+            </w:pPr>
+            <w:r>
+              <w:t xml:space="preserve">-12.5</w:t>
+            </w:r>
+          </w:p>
+        </w:tc>
+      </w:tr>
+      <w:tr>
+        <w:tc>
+          <w:tcPr/>
+          <w:p>
+            <w:pPr>
+              <w:pStyle w:val="Compact"/>
+              <w:jc w:val="center"/>
+            </w:pPr>
+            <w:r>
+              <w:t xml:space="preserve">Low flow recession</w:t>
+            </w:r>
+          </w:p>
+        </w:tc>
+        <w:tc>
+          <w:tcPr/>
+          <w:p>
+            <w:pPr>
+              <w:pStyle w:val="Compact"/>
+              <w:jc w:val="center"/>
+            </w:pPr>
+            <w:r>
+              <w:t xml:space="preserve">3</w:t>
+            </w:r>
+          </w:p>
+        </w:tc>
+        <w:tc>
+          <w:tcPr/>
+          <w:p>
+            <w:pPr>
+              <w:pStyle w:val="Compact"/>
+              <w:jc w:val="center"/>
+            </w:pPr>
+            <w:r>
+              <w:t xml:space="preserve">0</w:t>
+            </w:r>
+          </w:p>
+        </w:tc>
+      </w:tr>
+      <w:tr>
+        <w:tc>
+          <w:tcPr/>
+          <w:p>
+            <w:pPr>
+              <w:pStyle w:val="Compact"/>
+              <w:jc w:val="center"/>
+            </w:pPr>
+            <w:r>
+              <w:t xml:space="preserve">Average storm peak</w:t>
+            </w:r>
+          </w:p>
+        </w:tc>
+        <w:tc>
+          <w:tcPr/>
+          <w:p>
+            <w:pPr>
+              <w:pStyle w:val="Compact"/>
+              <w:jc w:val="center"/>
+            </w:pPr>
+            <w:r>
+              <w:t xml:space="preserve">15</w:t>
+            </w:r>
+          </w:p>
+        </w:tc>
+        <w:tc>
+          <w:tcPr/>
+          <w:p>
+            <w:pPr>
+              <w:pStyle w:val="Compact"/>
+              <w:jc w:val="center"/>
+            </w:pPr>
+            <w:r>
+              <w:t xml:space="preserve">0.2</w:t>
+            </w:r>
+          </w:p>
+        </w:tc>
+      </w:tr>
+      <w:tr>
+        <w:tc>
+          <w:tcPr/>
+          <w:p>
+            <w:pPr>
+              <w:pStyle w:val="Compact"/>
+              <w:jc w:val="center"/>
+            </w:pPr>
+            <w:r>
+              <w:t xml:space="preserve">Storm volume</w:t>
+            </w:r>
+          </w:p>
+        </w:tc>
+        <w:tc>
+          <w:tcPr/>
+          <w:p>
+            <w:pPr>
+              <w:pStyle w:val="Compact"/>
+              <w:jc w:val="center"/>
+            </w:pPr>
+            <w:r>
+              <w:t xml:space="preserve">15</w:t>
+            </w:r>
+          </w:p>
+        </w:tc>
+        <w:tc>
+          <w:tcPr/>
+          <w:p>
+            <w:pPr>
+              <w:pStyle w:val="Compact"/>
+              <w:jc w:val="center"/>
+            </w:pPr>
+            <w:r>
+              <w:t xml:space="preserve">-8.3</w:t>
+            </w:r>
+          </w:p>
+        </w:tc>
+      </w:tr>
+      <w:tr>
+        <w:tc>
+          <w:tcPr/>
+          <w:p>
+            <w:pPr>
+              <w:pStyle w:val="Compact"/>
+              <w:jc w:val="center"/>
+            </w:pPr>
+            <w:r>
+              <w:t xml:space="preserve">Seasonal volume</w:t>
+            </w:r>
+          </w:p>
+        </w:tc>
+        <w:tc>
+          <w:tcPr/>
+          <w:p>
+            <w:pPr>
+              <w:pStyle w:val="Compact"/>
+              <w:jc w:val="center"/>
+            </w:pPr>
+            <w:r>
+              <w:t xml:space="preserve">20</w:t>
+            </w:r>
+          </w:p>
+        </w:tc>
+        <w:tc>
+          <w:tcPr/>
+          <w:p>
+            <w:pPr>
+              <w:pStyle w:val="Compact"/>
+              <w:jc w:val="center"/>
+            </w:pPr>
+            <w:r>
+              <w:t xml:space="preserve">-6.6</w:t>
+            </w:r>
+          </w:p>
+        </w:tc>
+      </w:tr>
+      <w:tr>
+        <w:tc>
+          <w:tcPr/>
+          <w:p>
+            <w:pPr>
+              <w:pStyle w:val="Compact"/>
+              <w:jc w:val="center"/>
+            </w:pPr>
+            <w:r>
+              <w:t xml:space="preserve">Summer volume</w:t>
+            </w:r>
+          </w:p>
+        </w:tc>
+        <w:tc>
+          <w:tcPr/>
+          <w:p>
+            <w:pPr>
+              <w:pStyle w:val="Compact"/>
+              <w:jc w:val="center"/>
+            </w:pPr>
+            <w:r>
+              <w:t xml:space="preserve">20</w:t>
+            </w:r>
+          </w:p>
+        </w:tc>
+        <w:tc>
+          <w:tcPr/>
+          <w:p>
+            <w:pPr>
+              <w:pStyle w:val="Compact"/>
+              <w:jc w:val="center"/>
+            </w:pPr>
+            <w:r>
+              <w:t xml:space="preserve">-8.8</w:t>
+            </w:r>
+          </w:p>
+        </w:tc>
+      </w:tr>
+      <w:tr>
+        <w:tc>
+          <w:tcPr/>
+          <w:p>
+            <w:pPr>
+              <w:pStyle w:val="Compact"/>
+              <w:jc w:val="center"/>
+            </w:pPr>
+            <w:r>
+              <w:t xml:space="preserve">Winter volume</w:t>
+            </w:r>
+          </w:p>
+        </w:tc>
+        <w:tc>
+          <w:tcPr/>
+          <w:p>
+            <w:pPr>
+              <w:pStyle w:val="Compact"/>
+              <w:jc w:val="center"/>
+            </w:pPr>
+            <w:r>
+              <w:t xml:space="preserve">15</w:t>
+            </w:r>
+          </w:p>
+        </w:tc>
+        <w:tc>
+          <w:tcPr/>
+          <w:p>
+            <w:pPr>
+              <w:pStyle w:val="Compact"/>
+              <w:jc w:val="center"/>
+            </w:pPr>
+            <w:r>
+              <w:t xml:space="preserve">2.2</w:t>
+            </w:r>
+          </w:p>
+        </w:tc>
+      </w:tr>
+      <w:tr>
+        <w:tc>
+          <w:tcPr/>
+          <w:p>
+            <w:pPr>
+              <w:pStyle w:val="Compact"/>
+              <w:jc w:val="center"/>
+            </w:pPr>
+            <w:r>
+              <w:t xml:space="preserve">Summer storm volume</w:t>
+            </w:r>
+          </w:p>
+        </w:tc>
+        <w:tc>
+          <w:tcPr/>
+          <w:p>
+            <w:pPr>
+              <w:pStyle w:val="Compact"/>
+              <w:jc w:val="center"/>
+            </w:pPr>
+            <w:r>
+              <w:t xml:space="preserve">15</w:t>
+            </w:r>
+          </w:p>
+        </w:tc>
+        <w:tc>
+          <w:tcPr/>
+          <w:p>
+            <w:pPr>
+              <w:pStyle w:val="Compact"/>
+              <w:jc w:val="center"/>
+            </w:pPr>
+            <w:r>
+              <w:t xml:space="preserve">1.7</w:t>
+            </w:r>
+          </w:p>
+        </w:tc>
+      </w:tr>
+    </w:tbl>
+    <w:p>
+      <w:pPr>
+        <w:pStyle w:val="BodyText"/>
+      </w:pPr>
+      <w:r>
+        <w:t xml:space="preserve">Suspended sediment, total nitrogen (TN), and total phosphorus (TP) were also calibrated in the HSPF model using long‑term monitoring data collected at the USGS gaging station on Cypress Creek. Water quality samples collected by different agencies used different sampling protocols. Suspended sediment sample analysis used different filter sizes (e.g. 1 micron vs 0.45 micro) and thus one sampling effort did not fully capture the finer particles. Some of the suspended sediment data was screened to ensure that appropriate data was used in model calibration. The total nitrogen and total phosphorus analyses were similar and allowed for a more continuous data set.</w:t>
+      </w:r>
+    </w:p>
+    <w:p>
+      <w:pPr>
+        <w:pStyle w:val="BodyText"/>
+      </w:pPr>
+      <w:r>
+        <w:t xml:space="preserve">Following hydrologic model calibration, models were applied to estimate sediment, total nitrogen, and total phosphorous dynamics for each simulate land use. Nutrient model calibration was conducted in a two-fold approach with land use flux (lb/acre/year) compared against other regional observations from similar land uses and instream concentrations compared with measured values. Suspended sediment was simulated using land‑use‑specific erosion rates and reach‑scale scour and deposition processes, with calibration emphasizing consistency with observed storm and baseflow concentrations and maintenance of dynamic equilibrium in channel sediments. Median suspended sediment concentrations and land‑use‑based fluxes were within published literature ranges, and overall sediment model performance exhibited low bias and acceptable error statistics across flow regimes. Total nitrogen was simulated using a buildup–washoff formulation, with contributions from natural background processes, manure application, and septic systems, and calibration targeted observed concentrations during both baseflow and stormflow conditions. Modeled TN concentrations closely matched observed medians, with small median errors, low RMSE, and percent bias within accepted calibration targets. Total phosphorus was simulated using a combined buildup–washoff and sediment‑associated transport approach, with calibration constrained by observed instream concentrations and literature‑based land‑use export coefficients. Modeled TP concentrations were consistent with observed storm and baseflow medians, exhibited low absolute error, and fell within established performance criteria, indicating that the model reasonably reproduces sediment‑associated and dissolved nutrient transport dynamics at the watershed scale.</w:t>
+      </w:r>
+    </w:p>
+    <w:p>
+      <w:pPr>
+        <w:pStyle w:val="BodyText"/>
+      </w:pPr>
+      <w:r>
+        <w:t xml:space="preserve">Following calibration, models were applied to estimate sediment, nitrogen, and phosphorous yield in each of the 67 catchments. Sediment was simulated over the five year period from 2010-2015 and nutrients were simulated for the 11 years spanning 2013-2024. Modeled yield was aggregated temporally over the simulation period (6 years and 12 years for sediment and N/P, respectively). While 60 sub-catchments provided greater predictive accuracy in HSPF, this spatial resolution was considered finer scale (0.20* mi</w:t>
       </w:r>
       <w:r>
         <w:rPr>
@@ -1309,20 +1709,7 @@
         <w:t xml:space="preserve"> </w:t>
       </w:r>
       <w:r>
-        <w:t xml:space="preserve">average size) than needed for management. These sub-catchments were aggregated into 26 larger catchments for prioritization purposes (</w:t>
-      </w:r>
-      <w:r>
-        <w:rPr>
-          <w:b/>
-          <w:bCs/>
-        </w:rPr>
-        <w:t xml:space="preserve">XXX</w:t>
-      </w:r>
-      <w:r>
-        <w:t xml:space="preserve"> </w:t>
-      </w:r>
-      <w:r>
-        <w:t xml:space="preserve">mi</w:t>
+        <w:t xml:space="preserve">average size) than needed for management. These sub-catchments were aggregated into 26 larger catchments for prioritization purposes (1.31 mi</w:t>
       </w:r>
       <w:r>
         <w:rPr>
@@ -1356,24 +1743,6 @@
         <w:pStyle w:val="FirstParagraph"/>
       </w:pPr>
       <w:r>
-        <w:t xml:space="preserve">(</w:t>
-      </w:r>
-      <w:r>
-        <w:rPr>
-          <w:b/>
-          <w:bCs/>
-        </w:rPr>
-        <w:t xml:space="preserve">Looking for Maya and Julia’s help here.</w:t>
-      </w:r>
-      <w:r>
-        <w:t xml:space="preserve">)</w:t>
-      </w:r>
-    </w:p>
-    <w:p>
-      <w:pPr>
-        <w:pStyle w:val="BodyText"/>
-      </w:pPr>
-      <w:r>
         <w:t xml:space="preserve">The extent of BMP application may be significantly reduced, if actions are placed strategically throughout the watershed in locations with the greatest return-on-investment. This section describes two different analyses to identify strategically important catchments for BMP application: (1) catchment ranking and (2) multiple criteria decision analysis (MCDA). The ranking method identified catchments with high pollutant loading and feasibility for management based on separate criteria. Conversely, the MCDA compared each catchment based on a weighted average of multiple criteria summarized in a single score. Each technique provides different insights into the prioritization process, and catchments identified as high reward under different sets of assumptions provide confidence that BMP application in these areas will provide the greatest return-on-investment.</w:t>
       </w:r>
     </w:p>
@@ -1465,7 +1834,7 @@
         <w:pStyle w:val="BodyText"/>
       </w:pPr>
       <w:r>
-        <w:t xml:space="preserve">A form of MCDA was used to prioritize catchments in the Brewer Lake watershed using a weighted-score based on multiple criteria. Five criteria were included in this analysis: flux of sediment, flux of total nitrogen, flux of total phosphorous, proportion of land use in pasture, and distance from the catchment outlet to Brewer Lake. All metrics were converted to a 1 to 5 scale for comparison across different units with 1 and 5 representing less and more preferable outcomes, respectively. Flux scores were computed based on the quantiles of the data from 0-20%, 20-40%, 40-60%, 60-80%, and 80-100% with corresponding scores of 1, 2, 3, 4, and 5, respectively. Land use was assessed based on proportion of pasture in the catchment with thresholds at &lt; 30%, 30-40%, 40-50%, 50-60%, and &gt; 60% for 1 to 5 scores. Distance to the lake was normalized as 0 miles, 0-1 miles, 1-2 miles, 2-3 miles, 3-4 miles, and &gt; 4 miles for scores 5 to 1. Weighting was determined based on pairwise comparison of the relative importance of each criteria, where sediment, nitrogen, phosphorous, land use, and distance were ultimately weighted as 20%, 27%, 33%, 13%, and 7%, respectively. All normalized metrics were combined through a weighted-average to produce an overall score for each catchment on a 1 to 5 scale, where 5 represents the highest priority catchment.</w:t>
+        <w:t xml:space="preserve">A form of MCDA was used to prioritize catchments in the Brewer Lake watershed using a weighted-score based on multiple criteria. Five criteria were included in this analysis: flux of sediment, flux of total nitrogen, flux of total phosphorous, proportion of land use in pasture, and distance from the catchment outlet to Brewer Lake. All metrics were converted to a 1 to 5 scale for comparison across different units with 1 and 5 representing less and more preferable outcomes, respectively. Flux scores were computed based on the quantiles of the data from 0-20%, 20-40%, 40-60%, 60-80%, and 80-100% with corresponding scores of 1, 2, 3, 4, and 5, respectively. Land use was assessed based on proportion of pasture in the catchment with thresholds at &lt; 30%, 30-40%, 40-50%, 50-60%, and &gt; 60% for 1 to 5 scores. Travel time was normalized as 0 days, 0-1.8 days, 1.8-2.4 days, 2.4-3.5 days, and &gt;3.5 days for scores 5 to 1. Weighting was determined based on pairwise comparison of the relative importance of each criteria, where sediment, nitrogen, phosphorous, land use, and distance were ultimately weighted as 20%, 27%, 33%, 13%, and 7%, respectively. All normalized metrics were combined through a weighted-average to produce an overall score for each catchment on a 1 to 5 scale, where 5 represents the highest priority catchment.</w:t>
       </w:r>
     </w:p>
     <w:bookmarkEnd w:id="32"/>
@@ -1488,25 +1857,7 @@
         <w:pStyle w:val="FirstParagraph"/>
       </w:pPr>
       <w:r>
-        <w:t xml:space="preserve">(</w:t>
-      </w:r>
-      <w:r>
-        <w:rPr>
-          <w:b/>
-          <w:bCs/>
-        </w:rPr>
-        <w:t xml:space="preserve">Looking for Maya and Julianna’s help here.</w:t>
-      </w:r>
-      <w:r>
-        <w:t xml:space="preserve">)</w:t>
-      </w:r>
-    </w:p>
-    <w:p>
-      <w:pPr>
-        <w:pStyle w:val="BodyText"/>
-      </w:pPr>
-      <w:r>
-        <w:t xml:space="preserve">Catchment prioritization provides a mechanism for identifying a reduced number of locations in the watershed. However, the reduced extent of actions has the potential to make load reduction goals infeasible. This analysis examines whether watershed-wide load reduction goals can be achieved in the smaller footprint of the prioritized catchments.</w:t>
+        <w:t xml:space="preserve">Catchment prioritization provides a mechanism for identifying a reduced number of locations in the watershed where BMPs may be effective. However, the reduced extent of actions has the potential to make load reduction goals infeasible. This analysis examines whether watershed-wide load reduction goals can be achieved in the smaller footprint of the prioritized catchments.</w:t>
       </w:r>
     </w:p>
     <w:p>
@@ -1574,7 +1925,7 @@
         <w:pStyle w:val="BodyText"/>
       </w:pPr>
       <w:r>
-        <w:t xml:space="preserve">Analyses indicate that pasture-oriented practices are more effective for nitrogen removal, whereas river-oriented practices more efficiently remove phosphorous and sediment. Using only pasture management practices, large amounts of pasture land would need to be converted to BMP application (i.e., 62% of existing pasture). River corridor BMPs achieve the load targets with significantly less pasture conversion (i.e., 43% of existing pasture), and combinations of practices further reduced land requirements (i.e., 41% of existing pasture). Notably, these values do not imply taking land out of pasture-oriented uses, but instead application of BMPs in those lands (e.g., cattle fencing, rotational grazing, poultry litter management). While ambitious in the scope and scale of BMP application, PLET results indicate that the nutrient removal targets are feasible, particularly with an emphasis on river corridor management.</w:t>
+        <w:t xml:space="preserve">Analyses indicate that pasture-oriented practices are more effective for nitrogen removal, whereas river-oriented practices more efficiently remove phosphorous and sediment. Using only pasture management practices, large amounts of pasture land would need BMP treatment (i.e., 62% of existing pasture). River corridor BMPs achieve the load targets with significantly less pasture conversion (i.e., 43% of existing pasture), and combinations of practices further reduced land requirements (i.e., 41% of existing pasture). Notably, these values do not imply taking land out of pasture-oriented uses, but instead application of BMPs in those lands (e.g., cattle fencing, rotational grazing, poultry litter management). While ambitious in the scope and scale of BMP application, PLET results indicate that the nutrient removal targets are feasible, particularly with an emphasis on river corridor management.</w:t>
       </w:r>
     </w:p>
     <w:p>
@@ -1651,64 +2002,39 @@
         <w:pStyle w:val="FirstParagraph"/>
       </w:pPr>
       <w:r>
-        <w:t xml:space="preserve">(</w:t>
-      </w:r>
-      <w:r>
-        <w:rPr>
-          <w:b/>
-          <w:bCs/>
-        </w:rPr>
-        <w:t xml:space="preserve">Looking for Drew’s help here, particularly with adding descriptions of outcomes.</w:t>
-      </w:r>
-      <w:r>
-        <w:t xml:space="preserve">)</w:t>
-      </w:r>
-    </w:p>
-    <w:p>
-      <w:pPr>
-        <w:pStyle w:val="BodyText"/>
-      </w:pPr>
-      <w:r>
-        <w:t xml:space="preserve">Sediment, nitrogen, and phosphorous yield was estimated for each of the 26 catchments using HSPF. Modeled water quality loading shows significant differences across the watershed for each constituent (Figure 3).</w:t>
-      </w:r>
-    </w:p>
-    <w:p>
-      <w:pPr>
-        <w:pStyle w:val="BodyText"/>
-      </w:pPr>
-      <w:r>
-        <w:t xml:space="preserve">Sediment paragraph - Qualitative description of overarching issues in the watershed. Ranges of yield from the models (Figure 3A). Key observations from the results about hotspots or patterns.</w:t>
-      </w:r>
-    </w:p>
-    <w:p>
-      <w:pPr>
-        <w:pStyle w:val="BodyText"/>
-      </w:pPr>
-      <w:r>
-        <w:t xml:space="preserve">Nitrogen paragraph - Qualitative description of overarching issues in the watershed. Ranges of yield from the models (Figure 3B). Key observations from the results about hotspots or patterns.</w:t>
-      </w:r>
-    </w:p>
-    <w:p>
-      <w:pPr>
-        <w:pStyle w:val="BodyText"/>
-      </w:pPr>
-      <w:r>
-        <w:t xml:space="preserve">Phosphorous paragraph - Qualitative description of overarching issues in the watershed. Ranges of yield from the models (Figure 3C). Key observations from the results about hotspots or patterns.</w:t>
-      </w:r>
-    </w:p>
-    <w:p>
-      <w:pPr>
-        <w:pStyle w:val="BodyText"/>
-      </w:pPr>
-      <w:r>
-        <w:t xml:space="preserve">Overall, HSPF modeling provided an important mechanism for identifying sources of sediment, nitrogen, and phosphorous. Collectively,…</w:t>
-      </w:r>
-      <w:r>
-        <w:rPr>
-          <w:b/>
-          <w:bCs/>
-        </w:rPr>
-        <w:t xml:space="preserve">Can we say something here about general trends across the constituents? Maybe something about general hotspots on the east side of the basin?</w:t>
+        <w:t xml:space="preserve">Sediment, total nitrogen, and total phosphorus yields were estimated for each delineated catchment using the calibrated HSPF watershed model. Constituent loading was computed by simulating land‑use‑specific buildup and washoff processes, sediment detachment and transport, and routing through the stream network to account for spatial variability in hydrology and watershed characteristics. Modeled results indicate substantial heterogeneity in sediment and nutrient yields across the watershed, reflecting differences in land cover, soil properties, topography, and the spatial distribution of anthropogenic sources such as agriculture, unpaved roads, and developed areas. Higher yields of suspended sediment and nutrients were generally associated with catchments characterized by greater disturbance and runoff potential, while lower yields occurred in more forested and less developed areas (Figure 3). These results highlight the importance of spatially explicit watershed modeling for identifying areas that disproportionately contribute sediment and nutrient loads and for informing targeted watershed management and mitigation strategies.</w:t>
+      </w:r>
+    </w:p>
+    <w:p>
+      <w:pPr>
+        <w:pStyle w:val="BodyText"/>
+      </w:pPr>
+      <w:r>
+        <w:t xml:space="preserve">Modeled sediment yields exhibited substantial spatial variability across the watershed, reflecting differences in land use, soil erodibility, slope, and hydrologic connectivity (Figure 3A). Catchment‑scale sediment yields were relatively low in predominantly forested areas to substantially higher in catchments influenced by pasture land, unpaved roads, and developed areas. Elevated sediment yields tend to cluster in portions of the watershed with steeper slopes and greater surface runoff potential, as well as along stream corridors where channel scour and bank erosion contribute to sediment delivery. In contrast, catchments dominated by forest cover generally exhibit lower sediment yields, indicating greater infiltration capacity and reduced erosive energy. These patterns suggest that sediment loading is driven by both upland land‑use characteristics and in‑stream processes, resulting in discrete sediment source areas that function as watershed‑scale hotspots.</w:t>
+      </w:r>
+    </w:p>
+    <w:p>
+      <w:pPr>
+        <w:pStyle w:val="BodyText"/>
+      </w:pPr>
+      <w:r>
+        <w:t xml:space="preserve">Total nitrogen yields showed spatial heterogeneity across the watershed, driven by differences in land use, nutrient sources, and runoff generation. Simulated nitrogen yields range from relatively low values in forested and minimally disturbed catchments to higher yields in areas influenced by pasture, agricultural activity, septic system density, and developed land uses (Figure 3B). Nitrogen hotspots are spatially associated with catchments receiving manure applications or containing higher concentrations of anthropogenic nutrient sources, as well as areas with greater hydrologic connectivity that facilitate nutrient transport during storm events. Lower nitrogen yields occur in headwater catchments dominated by forest cover, where uptake, infiltration, and reduced runoff limit nitrogen export. Overall, the modeled patterns indicate that nitrogen loading is strongly influenced by land management practices and source distribution, rather than being uniformly distributed across the watershed.</w:t>
+      </w:r>
+    </w:p>
+    <w:p>
+      <w:pPr>
+        <w:pStyle w:val="BodyText"/>
+      </w:pPr>
+      <w:r>
+        <w:t xml:space="preserve">Modeled total phosphorus yields also vary considerably among catchments, reflecting the combined influence of sediment‑associated transport, land disturbance, and nutrient source inputs (Figure 3C). HSPF simulations indicate that phosphorus yields span a broad range, with higher yields occurring in catchments characterized by increased sediment production, agricultural land use, unpaved roads, and other disturbed surfaces. Spatial patterns show that phosphorus hotspots frequently coincide with areas of elevated sediment yield, consistent with the strong association between phosphorus and particulate transport. Catchments with lower slopes and higher forest cover generally exhibit reduced phosphorus yields, suggesting effective attenuation through soil sorption, reduced erosion, and lower runoff volumes. These results highlight the close coupling between sediment dynamics and phosphorus export and underscore the importance of managing erosive sources to reduce phosphorus loading at the watershed scale.</w:t>
+      </w:r>
+    </w:p>
+    <w:p>
+      <w:pPr>
+        <w:pStyle w:val="BodyText"/>
+      </w:pPr>
+      <w:r>
+        <w:t xml:space="preserve">Overall, HSPF modeling provided an effective framework for identifying and comparing sources of sediment, total nitrogen, and total phosphorus across the watershed. Collectively, results indicate that while the magnitude and transport mechanisms differ among constituents, common spatial patterns emerge, with elevated yields of sediment and nutrients consistently associated with areas of greater land disturbance, runoff potential, and hydrologic connectivity. Across all three constituents, a subset of catchments contributes disproportionately to overall watershed loading, suggesting the presence of localized source areas rather than uniform export. Notably, higher sediment and nutrient yields tend to co‑occur in portions of the eastern side of the basin, reflecting the combined influence of land use, soils, and topography on runoff and constituent transport. In contrast, more forested and less disturbed areas generally exhibit lower yields across constituents. These consistent spatial trends underscore the value of integrated watershed modeling for identifying multi‑constituent hotspots and supporting targeted management strategies that address sediment and nutrient loading simultaneously.</w:t>
       </w:r>
     </w:p>
     <w:p>
@@ -1856,7 +2182,7 @@
         <w:pStyle w:val="BodyText"/>
       </w:pPr>
       <w:r>
-        <w:t xml:space="preserve">The MCDA produced an estimate of the potential for load reduction in each catchment, which can be summarized relative to the individual criteria or the overall weighted score (Table 2). Catchments 1 and 19 show the greatest potential benefit relative to these prioritization criteria. Catchments 9, 10, 13, and 25 also show promise but with slightly lower scores. Based on the MCDA, Catchments 1, 9, 10, 13, 19, and 25 are identified as key opportunities for watershed management actions.</w:t>
+        <w:t xml:space="preserve">The MCDA produced an estimate of the potential for load reduction in each catchment, which can be summarized relative to the individual criteria or the overall weighted score (Table 3). Catchments 1 and 19 show the greatest potential benefit relative to these prioritization criteria. Catchments 9, 10, 13, and 25 also show promise but with slightly lower scores. Based on the MCDA, Catchments 1, 9, 10, 13, 19, and 25 are identified as key opportunities for watershed management actions.</w:t>
       </w:r>
     </w:p>
     <w:p>
@@ -1864,7 +2190,7 @@
         <w:pStyle w:val="TableCaption"/>
       </w:pPr>
       <w:r>
-        <w:t xml:space="preserve">Table 2. Summary of MCDA metrics for prioritization.</w:t>
+        <w:t xml:space="preserve">Table 3. Summary of MCDA metrics for prioritization.</w:t>
       </w:r>
     </w:p>
     <w:tbl>
@@ -1873,15 +2199,16 @@
         <w:tblW w:type="pct" w:w="5000"/>
         <w:tblLayout w:type="fixed"/>
         <w:tblLook w:firstRow="1" w:lastRow="0" w:firstColumn="0" w:lastColumn="0" w:noHBand="0" w:noVBand="0" w:val="0020"/>
-        <w:tblCaption w:val="Table 2. Summary of MCDA metrics for prioritization."/>
+        <w:tblCaption w:val="Table 3. Summary of MCDA metrics for prioritization."/>
       </w:tblPr>
       <w:tblGrid>
-        <w:gridCol w:w="1028"/>
-        <w:gridCol w:w="1028"/>
-        <w:gridCol w:w="1337"/>
-        <w:gridCol w:w="1851"/>
-        <w:gridCol w:w="1028"/>
-        <w:gridCol w:w="1645"/>
+        <w:gridCol w:w="1500"/>
+        <w:gridCol w:w="833"/>
+        <w:gridCol w:w="833"/>
+        <w:gridCol w:w="1083"/>
+        <w:gridCol w:w="1500"/>
+        <w:gridCol w:w="833"/>
+        <w:gridCol w:w="1333"/>
       </w:tblGrid>
       <w:tr>
         <w:trPr>
@@ -1895,6 +2222,18 @@
               <w:jc w:val="center"/>
             </w:pPr>
             <w:r>
+              <w:t xml:space="preserve">Catchment Number</w:t>
+            </w:r>
+          </w:p>
+        </w:tc>
+        <w:tc>
+          <w:tcPr/>
+          <w:p>
+            <w:pPr>
+              <w:pStyle w:val="Compact"/>
+              <w:jc w:val="center"/>
+            </w:pPr>
+            <w:r>
               <w:t xml:space="preserve">Sediment</w:t>
             </w:r>
           </w:p>
@@ -1969,6 +2308,18 @@
               <w:jc w:val="center"/>
             </w:pPr>
             <w:r>
+              <w:t xml:space="preserve">1</w:t>
+            </w:r>
+          </w:p>
+        </w:tc>
+        <w:tc>
+          <w:tcPr/>
+          <w:p>
+            <w:pPr>
+              <w:pStyle w:val="Compact"/>
+              <w:jc w:val="center"/>
+            </w:pPr>
+            <w:r>
               <w:t xml:space="preserve">5</w:t>
             </w:r>
           </w:p>
@@ -2079,6 +2430,18 @@
               <w:jc w:val="center"/>
             </w:pPr>
             <w:r>
+              <w:t xml:space="preserve">2</w:t>
+            </w:r>
+          </w:p>
+        </w:tc>
+        <w:tc>
+          <w:tcPr/>
+          <w:p>
+            <w:pPr>
+              <w:pStyle w:val="Compact"/>
+              <w:jc w:val="center"/>
+            </w:pPr>
+            <w:r>
               <w:t xml:space="preserve">1</w:t>
             </w:r>
           </w:p>
@@ -2117,6 +2480,18 @@
               <w:jc w:val="center"/>
             </w:pPr>
             <w:r>
+              <w:t xml:space="preserve">3</w:t>
+            </w:r>
+          </w:p>
+        </w:tc>
+        <w:tc>
+          <w:tcPr/>
+          <w:p>
+            <w:pPr>
+              <w:pStyle w:val="Compact"/>
+              <w:jc w:val="center"/>
+            </w:pPr>
+            <w:r>
               <w:t xml:space="preserve">2</w:t>
             </w:r>
           </w:p>
@@ -2203,6 +2578,18 @@
               <w:jc w:val="center"/>
             </w:pPr>
             <w:r>
+              <w:t xml:space="preserve">4</w:t>
+            </w:r>
+          </w:p>
+        </w:tc>
+        <w:tc>
+          <w:tcPr/>
+          <w:p>
+            <w:pPr>
+              <w:pStyle w:val="Compact"/>
+              <w:jc w:val="center"/>
+            </w:pPr>
+            <w:r>
               <w:t xml:space="preserve">3</w:t>
             </w:r>
           </w:p>
@@ -2265,6 +2652,18 @@
               <w:jc w:val="center"/>
             </w:pPr>
             <w:r>
+              <w:t xml:space="preserve">5</w:t>
+            </w:r>
+          </w:p>
+        </w:tc>
+        <w:tc>
+          <w:tcPr/>
+          <w:p>
+            <w:pPr>
+              <w:pStyle w:val="Compact"/>
+              <w:jc w:val="center"/>
+            </w:pPr>
+            <w:r>
               <w:t xml:space="preserve">3</w:t>
             </w:r>
           </w:p>
@@ -2339,6 +2738,18 @@
               <w:jc w:val="center"/>
             </w:pPr>
             <w:r>
+              <w:t xml:space="preserve">6</w:t>
+            </w:r>
+          </w:p>
+        </w:tc>
+        <w:tc>
+          <w:tcPr/>
+          <w:p>
+            <w:pPr>
+              <w:pStyle w:val="Compact"/>
+              <w:jc w:val="center"/>
+            </w:pPr>
+            <w:r>
               <w:t xml:space="preserve">4</w:t>
             </w:r>
           </w:p>
@@ -2413,6 +2824,18 @@
               <w:jc w:val="center"/>
             </w:pPr>
             <w:r>
+              <w:t xml:space="preserve">7</w:t>
+            </w:r>
+          </w:p>
+        </w:tc>
+        <w:tc>
+          <w:tcPr/>
+          <w:p>
+            <w:pPr>
+              <w:pStyle w:val="Compact"/>
+              <w:jc w:val="center"/>
+            </w:pPr>
+            <w:r>
               <w:t xml:space="preserve">2</w:t>
             </w:r>
           </w:p>
@@ -2487,6 +2910,18 @@
               <w:jc w:val="center"/>
             </w:pPr>
             <w:r>
+              <w:t xml:space="preserve">8</w:t>
+            </w:r>
+          </w:p>
+        </w:tc>
+        <w:tc>
+          <w:tcPr/>
+          <w:p>
+            <w:pPr>
+              <w:pStyle w:val="Compact"/>
+              <w:jc w:val="center"/>
+            </w:pPr>
+            <w:r>
               <w:t xml:space="preserve">1</w:t>
             </w:r>
           </w:p>
@@ -2561,6 +2996,18 @@
               <w:jc w:val="center"/>
             </w:pPr>
             <w:r>
+              <w:t xml:space="preserve">9</w:t>
+            </w:r>
+          </w:p>
+        </w:tc>
+        <w:tc>
+          <w:tcPr/>
+          <w:p>
+            <w:pPr>
+              <w:pStyle w:val="Compact"/>
+              <w:jc w:val="center"/>
+            </w:pPr>
+            <w:r>
               <w:t xml:space="preserve">5</w:t>
             </w:r>
           </w:p>
@@ -2635,6 +3082,18 @@
               <w:jc w:val="center"/>
             </w:pPr>
             <w:r>
+              <w:t xml:space="preserve">10</w:t>
+            </w:r>
+          </w:p>
+        </w:tc>
+        <w:tc>
+          <w:tcPr/>
+          <w:p>
+            <w:pPr>
+              <w:pStyle w:val="Compact"/>
+              <w:jc w:val="center"/>
+            </w:pPr>
+            <w:r>
               <w:t xml:space="preserve">5</w:t>
             </w:r>
           </w:p>
@@ -2709,6 +3168,18 @@
               <w:jc w:val="center"/>
             </w:pPr>
             <w:r>
+              <w:t xml:space="preserve">11</w:t>
+            </w:r>
+          </w:p>
+        </w:tc>
+        <w:tc>
+          <w:tcPr/>
+          <w:p>
+            <w:pPr>
+              <w:pStyle w:val="Compact"/>
+              <w:jc w:val="center"/>
+            </w:pPr>
+            <w:r>
               <w:t xml:space="preserve">1</w:t>
             </w:r>
           </w:p>
@@ -2783,6 +3254,18 @@
               <w:jc w:val="center"/>
             </w:pPr>
             <w:r>
+              <w:t xml:space="preserve">12</w:t>
+            </w:r>
+          </w:p>
+        </w:tc>
+        <w:tc>
+          <w:tcPr/>
+          <w:p>
+            <w:pPr>
+              <w:pStyle w:val="Compact"/>
+              <w:jc w:val="center"/>
+            </w:pPr>
+            <w:r>
               <w:t xml:space="preserve">4</w:t>
             </w:r>
           </w:p>
@@ -2857,6 +3340,18 @@
               <w:jc w:val="center"/>
             </w:pPr>
             <w:r>
+              <w:t xml:space="preserve">13</w:t>
+            </w:r>
+          </w:p>
+        </w:tc>
+        <w:tc>
+          <w:tcPr/>
+          <w:p>
+            <w:pPr>
+              <w:pStyle w:val="Compact"/>
+              <w:jc w:val="center"/>
+            </w:pPr>
+            <w:r>
               <w:t xml:space="preserve">5</w:t>
             </w:r>
           </w:p>
@@ -2931,6 +3426,18 @@
               <w:jc w:val="center"/>
             </w:pPr>
             <w:r>
+              <w:t xml:space="preserve">14</w:t>
+            </w:r>
+          </w:p>
+        </w:tc>
+        <w:tc>
+          <w:tcPr/>
+          <w:p>
+            <w:pPr>
+              <w:pStyle w:val="Compact"/>
+              <w:jc w:val="center"/>
+            </w:pPr>
+            <w:r>
               <w:t xml:space="preserve">3</w:t>
             </w:r>
           </w:p>
@@ -3005,6 +3512,18 @@
               <w:jc w:val="center"/>
             </w:pPr>
             <w:r>
+              <w:t xml:space="preserve">15</w:t>
+            </w:r>
+          </w:p>
+        </w:tc>
+        <w:tc>
+          <w:tcPr/>
+          <w:p>
+            <w:pPr>
+              <w:pStyle w:val="Compact"/>
+              <w:jc w:val="center"/>
+            </w:pPr>
+            <w:r>
               <w:t xml:space="preserve">4</w:t>
             </w:r>
           </w:p>
@@ -3079,6 +3598,18 @@
               <w:jc w:val="center"/>
             </w:pPr>
             <w:r>
+              <w:t xml:space="preserve">16</w:t>
+            </w:r>
+          </w:p>
+        </w:tc>
+        <w:tc>
+          <w:tcPr/>
+          <w:p>
+            <w:pPr>
+              <w:pStyle w:val="Compact"/>
+              <w:jc w:val="center"/>
+            </w:pPr>
+            <w:r>
               <w:t xml:space="preserve">2</w:t>
             </w:r>
           </w:p>
@@ -3153,6 +3684,18 @@
               <w:jc w:val="center"/>
             </w:pPr>
             <w:r>
+              <w:t xml:space="preserve">17</w:t>
+            </w:r>
+          </w:p>
+        </w:tc>
+        <w:tc>
+          <w:tcPr/>
+          <w:p>
+            <w:pPr>
+              <w:pStyle w:val="Compact"/>
+              <w:jc w:val="center"/>
+            </w:pPr>
+            <w:r>
               <w:t xml:space="preserve">3</w:t>
             </w:r>
           </w:p>
@@ -3227,6 +3770,18 @@
               <w:jc w:val="center"/>
             </w:pPr>
             <w:r>
+              <w:t xml:space="preserve">18</w:t>
+            </w:r>
+          </w:p>
+        </w:tc>
+        <w:tc>
+          <w:tcPr/>
+          <w:p>
+            <w:pPr>
+              <w:pStyle w:val="Compact"/>
+              <w:jc w:val="center"/>
+            </w:pPr>
+            <w:r>
               <w:t xml:space="preserve">2</w:t>
             </w:r>
           </w:p>
@@ -3301,6 +3856,18 @@
               <w:jc w:val="center"/>
             </w:pPr>
             <w:r>
+              <w:t xml:space="preserve">19</w:t>
+            </w:r>
+          </w:p>
+        </w:tc>
+        <w:tc>
+          <w:tcPr/>
+          <w:p>
+            <w:pPr>
+              <w:pStyle w:val="Compact"/>
+              <w:jc w:val="center"/>
+            </w:pPr>
+            <w:r>
               <w:t xml:space="preserve">5</w:t>
             </w:r>
           </w:p>
@@ -3375,6 +3942,18 @@
               <w:jc w:val="center"/>
             </w:pPr>
             <w:r>
+              <w:t xml:space="preserve">20</w:t>
+            </w:r>
+          </w:p>
+        </w:tc>
+        <w:tc>
+          <w:tcPr/>
+          <w:p>
+            <w:pPr>
+              <w:pStyle w:val="Compact"/>
+              <w:jc w:val="center"/>
+            </w:pPr>
+            <w:r>
               <w:t xml:space="preserve">3</w:t>
             </w:r>
           </w:p>
@@ -3449,6 +4028,18 @@
               <w:jc w:val="center"/>
             </w:pPr>
             <w:r>
+              <w:t xml:space="preserve">21</w:t>
+            </w:r>
+          </w:p>
+        </w:tc>
+        <w:tc>
+          <w:tcPr/>
+          <w:p>
+            <w:pPr>
+              <w:pStyle w:val="Compact"/>
+              <w:jc w:val="center"/>
+            </w:pPr>
+            <w:r>
               <w:t xml:space="preserve">1</w:t>
             </w:r>
           </w:p>
@@ -3523,6 +4114,18 @@
               <w:jc w:val="center"/>
             </w:pPr>
             <w:r>
+              <w:t xml:space="preserve">22</w:t>
+            </w:r>
+          </w:p>
+        </w:tc>
+        <w:tc>
+          <w:tcPr/>
+          <w:p>
+            <w:pPr>
+              <w:pStyle w:val="Compact"/>
+              <w:jc w:val="center"/>
+            </w:pPr>
+            <w:r>
               <w:t xml:space="preserve">3</w:t>
             </w:r>
           </w:p>
@@ -3597,6 +4200,18 @@
               <w:jc w:val="center"/>
             </w:pPr>
             <w:r>
+              <w:t xml:space="preserve">23</w:t>
+            </w:r>
+          </w:p>
+        </w:tc>
+        <w:tc>
+          <w:tcPr/>
+          <w:p>
+            <w:pPr>
+              <w:pStyle w:val="Compact"/>
+              <w:jc w:val="center"/>
+            </w:pPr>
+            <w:r>
               <w:t xml:space="preserve">1</w:t>
             </w:r>
           </w:p>
@@ -3671,6 +4286,18 @@
               <w:jc w:val="center"/>
             </w:pPr>
             <w:r>
+              <w:t xml:space="preserve">24</w:t>
+            </w:r>
+          </w:p>
+        </w:tc>
+        <w:tc>
+          <w:tcPr/>
+          <w:p>
+            <w:pPr>
+              <w:pStyle w:val="Compact"/>
+              <w:jc w:val="center"/>
+            </w:pPr>
+            <w:r>
               <w:t xml:space="preserve">4</w:t>
             </w:r>
           </w:p>
@@ -3745,6 +4372,18 @@
               <w:jc w:val="center"/>
             </w:pPr>
             <w:r>
+              <w:t xml:space="preserve">25</w:t>
+            </w:r>
+          </w:p>
+        </w:tc>
+        <w:tc>
+          <w:tcPr/>
+          <w:p>
+            <w:pPr>
+              <w:pStyle w:val="Compact"/>
+              <w:jc w:val="center"/>
+            </w:pPr>
+            <w:r>
               <w:t xml:space="preserve">5</w:t>
             </w:r>
           </w:p>
@@ -3811,6 +4450,18 @@
         </w:tc>
       </w:tr>
       <w:tr>
+        <w:tc>
+          <w:tcPr/>
+          <w:p>
+            <w:pPr>
+              <w:pStyle w:val="Compact"/>
+              <w:jc w:val="center"/>
+            </w:pPr>
+            <w:r>
+              <w:t xml:space="preserve">26</w:t>
+            </w:r>
+          </w:p>
+        </w:tc>
         <w:tc>
           <w:tcPr/>
           <w:p>
@@ -4175,6 +4826,14 @@
       </w:pPr>
       <w:r>
         <w:t xml:space="preserve">Dillard M., Brooks C., Fisher H., Pietersen H., Nijhuis A., van Breda A., and Durden S. 2021. Engaging Communities and Stakeholders in Implementing NNBF. Chapter 3 in International Guidelines on Natural and Nature-Based Features for Flood Risk Management. Edited by T. S. Bridges, J. K. King, J. D. Simm, M. W. Beck, G. Collins, Q. Lodder, and R. K. Mohan. Vicksburg, MS: U.S. Army Engineer Research and Development Center.</w:t>
+      </w:r>
+    </w:p>
+    <w:p>
+      <w:pPr>
+        <w:pStyle w:val="BodyText"/>
+      </w:pPr>
+      <w:r>
+        <w:t xml:space="preserve">Donigian, A.S., Jr. (2000). HSPF Training Workshop Handbook and CD. Lecture #19: Calibration and Verification Issues. Prepared for the U.S. Environmental Protection Agency, Office of Water. EPA Headquarters, Washington, DC, January 10–14, 2000.</w:t>
       </w:r>
     </w:p>
     <w:p>

</xml_diff>

<commit_message>
Version submitted to Water
</commit_message>
<xml_diff>
--- a/index.docx
+++ b/index.docx
@@ -23,10 +23,131 @@
         <w:pStyle w:val="Date"/>
       </w:pPr>
       <w:r>
-        <w:t xml:space="preserve">March 2026</w:t>
-      </w:r>
-    </w:p>
-    <w:bookmarkStart w:id="21" w:name="author-notes"/>
+        <w:t xml:space="preserve">June 2026</w:t>
+      </w:r>
+    </w:p>
+    <w:bookmarkStart w:id="26" w:name="author-affiliations"/>
+    <w:p>
+      <w:pPr>
+        <w:pStyle w:val="Heading1"/>
+      </w:pPr>
+      <w:r>
+        <w:rPr>
+          <w:b/>
+          <w:bCs/>
+        </w:rPr>
+        <w:t xml:space="preserve">Author Affiliations</w:t>
+      </w:r>
+    </w:p>
+    <w:p>
+      <w:pPr>
+        <w:pStyle w:val="FirstParagraph"/>
+      </w:pPr>
+      <w:r>
+        <w:t xml:space="preserve">S. Kyle McKay, Woolpert,</w:t>
+      </w:r>
+      <w:r>
+        <w:t xml:space="preserve"> </w:t>
+      </w:r>
+      <w:hyperlink r:id="rId20">
+        <w:r>
+          <w:rPr>
+            <w:rStyle w:val="Hyperlink"/>
+          </w:rPr>
+          <w:t xml:space="preserve">kyle.mckay@woolpert.com</w:t>
+        </w:r>
+      </w:hyperlink>
+      <w:r>
+        <w:t xml:space="preserve">, Phone: +1 970-980-9747</w:t>
+      </w:r>
+      <w:r>
+        <w:t xml:space="preserve"> </w:t>
+      </w:r>
+      <w:r>
+        <w:t xml:space="preserve">Julianna Hunter, Woolpert,</w:t>
+      </w:r>
+      <w:r>
+        <w:t xml:space="preserve"> </w:t>
+      </w:r>
+      <w:hyperlink r:id="rId21">
+        <w:r>
+          <w:rPr>
+            <w:rStyle w:val="Hyperlink"/>
+          </w:rPr>
+          <w:t xml:space="preserve">Julianna.Hunter@woolpert.com</w:t>
+        </w:r>
+      </w:hyperlink>
+      <w:r>
+        <w:br/>
+      </w:r>
+      <w:r>
+        <w:t xml:space="preserve">Julia Ruff, Woolpert,</w:t>
+      </w:r>
+      <w:r>
+        <w:t xml:space="preserve"> </w:t>
+      </w:r>
+      <w:hyperlink r:id="rId22">
+        <w:r>
+          <w:rPr>
+            <w:rStyle w:val="Hyperlink"/>
+          </w:rPr>
+          <w:t xml:space="preserve">Julia.Ruff@woolpert.com</w:t>
+        </w:r>
+      </w:hyperlink>
+      <w:r>
+        <w:br/>
+      </w:r>
+      <w:r>
+        <w:t xml:space="preserve">Maya Burns, Woolpert,</w:t>
+      </w:r>
+      <w:r>
+        <w:t xml:space="preserve"> </w:t>
+      </w:r>
+      <w:hyperlink r:id="rId23">
+        <w:r>
+          <w:rPr>
+            <w:rStyle w:val="Hyperlink"/>
+          </w:rPr>
+          <w:t xml:space="preserve">Maya.Burns@woolpert.com</w:t>
+        </w:r>
+      </w:hyperlink>
+      <w:r>
+        <w:br/>
+      </w:r>
+      <w:r>
+        <w:t xml:space="preserve">Drew Ackerman, Black &amp; Veatch,</w:t>
+      </w:r>
+      <w:r>
+        <w:t xml:space="preserve"> </w:t>
+      </w:r>
+      <w:hyperlink r:id="rId24">
+        <w:r>
+          <w:rPr>
+            <w:rStyle w:val="Hyperlink"/>
+          </w:rPr>
+          <w:t xml:space="preserve">ackermanac@bv.com</w:t>
+        </w:r>
+      </w:hyperlink>
+      <w:r>
+        <w:br/>
+      </w:r>
+      <w:r>
+        <w:t xml:space="preserve">Michael Long, Woolpert,</w:t>
+      </w:r>
+      <w:r>
+        <w:t xml:space="preserve"> </w:t>
+      </w:r>
+      <w:hyperlink r:id="rId25">
+        <w:r>
+          <w:rPr>
+            <w:rStyle w:val="Hyperlink"/>
+          </w:rPr>
+          <w:t xml:space="preserve">Michael.Long@woolpert.com</w:t>
+        </w:r>
+      </w:hyperlink>
+    </w:p>
+    <w:bookmarkEnd w:id="26"/>
+    <w:bookmarkStart w:id="28" w:name="author-notes"/>
     <w:p>
       <w:pPr>
         <w:pStyle w:val="Heading1"/>
@@ -44,75 +165,12 @@
         <w:pStyle w:val="FirstParagraph"/>
       </w:pPr>
       <w:r>
-        <w:t xml:space="preserve">This document is a working draft of a journal paper summarizing the Brewer Lake watershed study. A few notes:</w:t>
-      </w:r>
-    </w:p>
-    <w:p>
-      <w:pPr>
-        <w:pStyle w:val="Compact"/>
-        <w:numPr>
-          <w:ilvl w:val="0"/>
-          <w:numId w:val="1001"/>
-        </w:numPr>
-      </w:pPr>
-      <w:r>
-        <w:rPr>
-          <w:i/>
-          <w:iCs/>
-        </w:rPr>
-        <w:t xml:space="preserve">Authorship</w:t>
-      </w:r>
-      <w:r>
-        <w:t xml:space="preserve">: The authorship list is simply a first volley based on contributions to the USACE report and journal paper to date. Team members can be added as needed, and we need to discuss the relative order of authors.</w:t>
-      </w:r>
-      <w:r>
-        <w:br/>
-      </w:r>
-    </w:p>
-    <w:p>
-      <w:pPr>
-        <w:pStyle w:val="Compact"/>
-        <w:numPr>
-          <w:ilvl w:val="0"/>
-          <w:numId w:val="1001"/>
-        </w:numPr>
-      </w:pPr>
-      <w:r>
-        <w:rPr>
-          <w:i/>
-          <w:iCs/>
-        </w:rPr>
-        <w:t xml:space="preserve">Audience</w:t>
-      </w:r>
-      <w:r>
-        <w:t xml:space="preserve">: Largely focused on applied water science community and practitioners developing watershed management plans. Secondary audience is government entities funding watershed assessments. Probably best reached through an open access journal.</w:t>
-      </w:r>
-      <w:r>
-        <w:br/>
-      </w:r>
-    </w:p>
-    <w:p>
-      <w:pPr>
-        <w:pStyle w:val="Compact"/>
-        <w:numPr>
-          <w:ilvl w:val="0"/>
-          <w:numId w:val="1001"/>
-        </w:numPr>
-      </w:pPr>
-      <w:r>
-        <w:rPr>
-          <w:i/>
-          <w:iCs/>
-        </w:rPr>
-        <w:t xml:space="preserve">Proposed Outlet</w:t>
-      </w:r>
-      <w:r>
-        <w:t xml:space="preserve">:</w:t>
+        <w:t xml:space="preserve">This document is submitted to</w:t>
       </w:r>
       <w:r>
         <w:t xml:space="preserve"> </w:t>
       </w:r>
-      <w:hyperlink r:id="rId20">
+      <w:hyperlink r:id="rId27">
         <w:r>
           <w:rPr>
             <w:rStyle w:val="Hyperlink"/>
@@ -120,9 +178,15 @@
           <w:t xml:space="preserve">Water</w:t>
         </w:r>
       </w:hyperlink>
-    </w:p>
-    <w:bookmarkEnd w:id="21"/>
-    <w:bookmarkStart w:id="22" w:name="abstract"/>
+      <w:r>
+        <w:t xml:space="preserve"> </w:t>
+      </w:r>
+      <w:r>
+        <w:t xml:space="preserve">for the article publication type. All authors have approved the content of the submitted manuscript. The manuscript is not under consideration for any other publication outlets.</w:t>
+      </w:r>
+    </w:p>
+    <w:bookmarkEnd w:id="28"/>
+    <w:bookmarkStart w:id="29" w:name="abstract"/>
     <w:p>
       <w:pPr>
         <w:pStyle w:val="Heading1"/>
@@ -158,8 +222,8 @@
         <w:t xml:space="preserve">: watershed plan, multi-criteria decision analysis, HSPF, watershed modeling, integrated modeling, best management practices</w:t>
       </w:r>
     </w:p>
-    <w:bookmarkEnd w:id="22"/>
-    <w:bookmarkStart w:id="23" w:name="introduction"/>
+    <w:bookmarkEnd w:id="29"/>
+    <w:bookmarkStart w:id="30" w:name="introduction"/>
     <w:p>
       <w:pPr>
         <w:pStyle w:val="Heading1"/>
@@ -216,8 +280,8 @@
         <w:t xml:space="preserve">In this paper, we contribute to the growing body of methods using MCDA to inform watershed management. Specifically, our objectives are to (1) incorporate constraints like cost and land ownership into MCDA frameworks, (2) show how multiple MCDA-based methods can be brought to bear at a single location to increase decision confidence, and (3) demonstrate simple MCDA methods that are aligned with preliminary watershed planning. We present these methods in the context of developing a watershed management plan for the Brewer Lake watershed in Arkansas, USA. The methods and techniques shown here were tailored to the geographic and project constraints for this watershed, and we offer these in the spirit of a case study exploring alternative approaches rather than research into preferred or superior approaches.</w:t>
       </w:r>
     </w:p>
-    <w:bookmarkEnd w:id="23"/>
-    <w:bookmarkStart w:id="35" w:name="methods"/>
+    <w:bookmarkEnd w:id="30"/>
+    <w:bookmarkStart w:id="42" w:name="methods"/>
     <w:p>
       <w:pPr>
         <w:pStyle w:val="Heading1"/>
@@ -243,7 +307,7 @@
         <w:pStyle w:val="Compact"/>
         <w:numPr>
           <w:ilvl w:val="0"/>
-          <w:numId w:val="1002"/>
+          <w:numId w:val="1001"/>
         </w:numPr>
       </w:pPr>
       <w:r>
@@ -265,7 +329,7 @@
         <w:pStyle w:val="Compact"/>
         <w:numPr>
           <w:ilvl w:val="0"/>
-          <w:numId w:val="1002"/>
+          <w:numId w:val="1001"/>
         </w:numPr>
       </w:pPr>
       <w:r>
@@ -287,7 +351,7 @@
         <w:pStyle w:val="Compact"/>
         <w:numPr>
           <w:ilvl w:val="0"/>
-          <w:numId w:val="1002"/>
+          <w:numId w:val="1001"/>
         </w:numPr>
       </w:pPr>
       <w:r>
@@ -309,7 +373,7 @@
         <w:pStyle w:val="Compact"/>
         <w:numPr>
           <w:ilvl w:val="0"/>
-          <w:numId w:val="1002"/>
+          <w:numId w:val="1001"/>
         </w:numPr>
       </w:pPr>
       <w:r>
@@ -331,7 +395,7 @@
         <w:pStyle w:val="Compact"/>
         <w:numPr>
           <w:ilvl w:val="0"/>
-          <w:numId w:val="1002"/>
+          <w:numId w:val="1001"/>
         </w:numPr>
       </w:pPr>
       <w:r>
@@ -371,7 +435,7 @@
         <w:pStyle w:val="Compact"/>
         <w:numPr>
           <w:ilvl w:val="0"/>
-          <w:numId w:val="1002"/>
+          <w:numId w:val="1001"/>
         </w:numPr>
       </w:pPr>
       <w:r>
@@ -385,7 +449,7 @@
         <w:t xml:space="preserve">? Many watershed studies prioritize actions in a small portion of the watershed, but there is often a need to revisit watershed objectives as a whole to understand the importance of these smaller scale actions at a larger scale (Menichino et al. 2025).</w:t>
       </w:r>
     </w:p>
-    <w:bookmarkStart w:id="27" w:name="brewer-lake-watershed"/>
+    <w:bookmarkStart w:id="34" w:name="brewer-lake-watershed"/>
     <w:p>
       <w:pPr>
         <w:pStyle w:val="Heading2"/>
@@ -476,18 +540,18 @@
           <wp:inline>
             <wp:extent cx="5334000" cy="4170617"/>
             <wp:effectExtent b="0" l="0" r="0" t="0"/>
-            <wp:docPr descr="Figure 1. Brewer Lake watershed land use and potential sources of water quality degradation (i.e., septic systems, poultry houses, and hydraulic fracturing extraction sites)" title="" id="25" name="Picture"/>
+            <wp:docPr descr="Figure 1. Brewer Lake watershed land use and potential sources of water quality degradation (i.e., septic systems, poultry houses, and hydraulic fracturing extraction sites)" title="" id="32" name="Picture"/>
             <a:graphic>
               <a:graphicData uri="http://schemas.openxmlformats.org/drawingml/2006/picture">
                 <pic:pic>
                   <pic:nvPicPr>
-                    <pic:cNvPr descr="01_BrewerLakeWatershedMap.png" id="26" name="Picture"/>
+                    <pic:cNvPr descr="01_BrewerLakeWatershedMap.png" id="33" name="Picture"/>
                     <pic:cNvPicPr>
                       <a:picLocks noChangeArrowheads="1" noChangeAspect="1"/>
                     </pic:cNvPicPr>
                   </pic:nvPicPr>
                   <pic:blipFill>
-                    <a:blip r:embed="rId24"/>
+                    <a:blip r:embed="rId31"/>
                     <a:stretch>
                       <a:fillRect/>
                     </a:stretch>
@@ -530,8 +594,8 @@
         <w:t xml:space="preserve">Brewer Lake was completed in 1983 through a partnership between the U.S. Army Corps of Engineers and the Conway Corporation, based on authorization from the Water Resources Development Act of 1974 (PL93-251, Title 1, Sec. 10). The primary purpose of the 28,500 acre-foot reservoir is water supply for over 70,000 residents in the city of Conway as well as nearby counties, although the lake is also used for fishing and recreation. Water quality changes can occur with land use change, and sediment, nitrogen, and phosphorous inputs to the lake are a particular focus for reservoir managers because of both drinking water requirements as well as secondary outcomes like harmful algal blooms and reduced reservoir life span (Mark Ferguson, Conway Corporation, personal observation). In the fall of 2020, a cyanobacterial bloom was observed intermittently, indicating a broader potential for water quality threats to this important drinking water source (Matthew Schroeder, Arkansas Game and Fish Commission, personal observation).</w:t>
       </w:r>
     </w:p>
-    <w:bookmarkEnd w:id="27"/>
-    <w:bookmarkStart w:id="28" w:name="watershed-planning-process"/>
+    <w:bookmarkEnd w:id="34"/>
+    <w:bookmarkStart w:id="35" w:name="watershed-planning-process"/>
     <w:p>
       <w:pPr>
         <w:pStyle w:val="Heading2"/>
@@ -973,8 +1037,8 @@
         </w:tc>
       </w:tr>
     </w:tbl>
-    <w:bookmarkEnd w:id="28"/>
-    <w:bookmarkStart w:id="29" w:name="Xe9558531c54250ac2355caa6614f3c28316298f"/>
+    <w:bookmarkEnd w:id="35"/>
+    <w:bookmarkStart w:id="36" w:name="Xe9558531c54250ac2355caa6614f3c28316298f"/>
     <w:p>
       <w:pPr>
         <w:pStyle w:val="Heading2"/>
@@ -1024,7 +1088,7 @@
         <w:pStyle w:val="Compact"/>
         <w:numPr>
           <w:ilvl w:val="0"/>
-          <w:numId w:val="1003"/>
+          <w:numId w:val="1002"/>
         </w:numPr>
       </w:pPr>
       <w:r>
@@ -1046,7 +1110,7 @@
         <w:pStyle w:val="Compact"/>
         <w:numPr>
           <w:ilvl w:val="0"/>
-          <w:numId w:val="1003"/>
+          <w:numId w:val="1002"/>
         </w:numPr>
       </w:pPr>
       <w:r>
@@ -1068,7 +1132,7 @@
         <w:pStyle w:val="Compact"/>
         <w:numPr>
           <w:ilvl w:val="0"/>
-          <w:numId w:val="1003"/>
+          <w:numId w:val="1002"/>
         </w:numPr>
       </w:pPr>
       <w:r>
@@ -1082,8 +1146,8 @@
         <w:t xml:space="preserve">. This scenario combines the strategies into a single scenario applying both practices.</w:t>
       </w:r>
     </w:p>
-    <w:bookmarkEnd w:id="29"/>
-    <w:bookmarkStart w:id="30" w:name="assessing-watershed-condition"/>
+    <w:bookmarkEnd w:id="36"/>
+    <w:bookmarkStart w:id="37" w:name="assessing-watershed-condition"/>
     <w:p>
       <w:pPr>
         <w:pStyle w:val="Heading2"/>
@@ -1697,7 +1761,7 @@
         <w:pStyle w:val="BodyText"/>
       </w:pPr>
       <w:r>
-        <w:t xml:space="preserve">Following calibration, models were applied to estimate sediment, nitrogen, and phosphorous yield in each of the 67 catchments. Sediment was simulated over the five year period from 2010-2015 and nutrients were simulated for the 11 years spanning 2013-2024. Modeled yield was aggregated temporally over the simulation period (6 years and 12 years for sediment and N/P, respectively). While 60 sub-catchments provided greater predictive accuracy in HSPF, this spatial resolution was considered finer scale (0.20* mi</w:t>
+        <w:t xml:space="preserve">Following calibration, models were applied to estimate sediment, nitrogen, and phosphorous yield in each of the 67 catchments. Sediment was simulated over the five year period from 2010-2015 and nutrients were simulated for the 11 years spanning 2013-2024. Modeled yield was aggregated temporally over the simulation period (6 years and 12 years for sediment and N/P, respectively). While 60 sub-catchments provided greater predictive accuracy in HSPF, this spatial resolution was considered finer scale (0.20 mi</w:t>
       </w:r>
       <w:r>
         <w:rPr>
@@ -1724,8 +1788,8 @@
         <w:t xml:space="preserve">average size), based on slope, soil type, land use, and proximity to Brewer Lake.</w:t>
       </w:r>
     </w:p>
-    <w:bookmarkEnd w:id="30"/>
-    <w:bookmarkStart w:id="33" w:name="prioritization-of-catchments"/>
+    <w:bookmarkEnd w:id="37"/>
+    <w:bookmarkStart w:id="40" w:name="prioritization-of-catchments"/>
     <w:p>
       <w:pPr>
         <w:pStyle w:val="Heading2"/>
@@ -1746,7 +1810,7 @@
         <w:t xml:space="preserve">The extent of BMP application may be significantly reduced, if actions are placed strategically throughout the watershed in locations with the greatest return-on-investment. This section describes two different analyses to identify strategically important catchments for BMP application: (1) catchment ranking and (2) multiple criteria decision analysis (MCDA). The ranking method identified catchments with high pollutant loading and feasibility for management based on separate criteria. Conversely, the MCDA compared each catchment based on a weighted average of multiple criteria summarized in a single score. Each technique provides different insights into the prioritization process, and catchments identified as high reward under different sets of assumptions provide confidence that BMP application in these areas will provide the greatest return-on-investment.</w:t>
       </w:r>
     </w:p>
-    <w:bookmarkStart w:id="31" w:name="ranking-based-prioritization"/>
+    <w:bookmarkStart w:id="38" w:name="ranking-based-prioritization"/>
     <w:p>
       <w:pPr>
         <w:pStyle w:val="Heading3"/>
@@ -1811,8 +1875,8 @@
         <w:t xml:space="preserve">alternatives. Finally, catchments providing low levels of either technical objectives or feasibility were eliminated from consideration in future analysis.</w:t>
       </w:r>
     </w:p>
-    <w:bookmarkEnd w:id="31"/>
-    <w:bookmarkStart w:id="32" w:name="mcda-based-prioritization"/>
+    <w:bookmarkEnd w:id="38"/>
+    <w:bookmarkStart w:id="39" w:name="mcda-based-prioritization"/>
     <w:p>
       <w:pPr>
         <w:pStyle w:val="Heading3"/>
@@ -1837,9 +1901,9 @@
         <w:t xml:space="preserve">A form of MCDA was used to prioritize catchments in the Brewer Lake watershed using a weighted-score based on multiple criteria. Five criteria were included in this analysis: flux of sediment, flux of total nitrogen, flux of total phosphorous, proportion of land use in pasture, and distance from the catchment outlet to Brewer Lake. All metrics were converted to a 1 to 5 scale for comparison across different units with 1 and 5 representing less and more preferable outcomes, respectively. Flux scores were computed based on the quantiles of the data from 0-20%, 20-40%, 40-60%, 60-80%, and 80-100% with corresponding scores of 1, 2, 3, 4, and 5, respectively. Land use was assessed based on proportion of pasture in the catchment with thresholds at &lt; 30%, 30-40%, 40-50%, 50-60%, and &gt; 60% for 1 to 5 scores. Travel time was normalized as 0 days, 0-1.8 days, 1.8-2.4 days, 2.4-3.5 days, and &gt;3.5 days for scores 5 to 1. Weighting was determined based on pairwise comparison of the relative importance of each criteria, where sediment, nitrogen, phosphorous, land use, and distance were ultimately weighted as 20%, 27%, 33%, 13%, and 7%, respectively. All normalized metrics were combined through a weighted-average to produce an overall score for each catchment on a 1 to 5 scale, where 5 represents the highest priority catchment.</w:t>
       </w:r>
     </w:p>
-    <w:bookmarkEnd w:id="32"/>
-    <w:bookmarkEnd w:id="33"/>
-    <w:bookmarkStart w:id="34" w:name="X380732814f4111ff980b863011c51eb401c37a1"/>
+    <w:bookmarkEnd w:id="39"/>
+    <w:bookmarkEnd w:id="40"/>
+    <w:bookmarkStart w:id="41" w:name="X380732814f4111ff980b863011c51eb401c37a1"/>
     <w:p>
       <w:pPr>
         <w:pStyle w:val="Heading2"/>
@@ -1876,9 +1940,9 @@
         <w:t xml:space="preserve">PLET was applied to examine the range of pollutant reduction possible at different levels of BMP implementation. Again, three scenarios were considered related to pasture BMPs, river BMPs, and combined BMPs. BMP implementation was varied from 0-100% for all pasture lands in the priority catchments. Sediment and nutrient removal efficiencies were used from the watershed-wide analysis and combined with local land use conditions in the priority watersheds. Load reduction was estimated for each priority watershed and summed for comparison with the watershed-wide goals of 15%.</w:t>
       </w:r>
     </w:p>
-    <w:bookmarkEnd w:id="34"/>
-    <w:bookmarkEnd w:id="35"/>
-    <w:bookmarkStart w:id="52" w:name="results"/>
+    <w:bookmarkEnd w:id="41"/>
+    <w:bookmarkEnd w:id="42"/>
+    <w:bookmarkStart w:id="59" w:name="results"/>
     <w:p>
       <w:pPr>
         <w:pStyle w:val="Heading1"/>
@@ -1899,7 +1963,7 @@
         <w:t xml:space="preserve">The watershed plan was developed through a series of analyses aligned with typical management questions, as outlined at the beginning of the Methods section. The context for decision making was developed to understand the history of management, modern land use, and potential future scenarios for the region. Section 2.1 briefly describes some of these issues, which were expanded in dialogs with and reports for regional stakeholders. With input from technical and non-technical stakeholders, a set of primary and secondary objectives were developed for the study (Table 1), which served as the primary organizational structure for subsequent analyses and prioritization. This section further describes the analytical results from preliminary modeling of numerical load reduction targets with PLET (Section 3.1), water quality condition assessment with HSPF (Section 3.2), catchment prioritization using two different MCDA methods (Section 3.3), and anticipated water quality outcomes in the prioritized watersheds (Section 3.4).</w:t>
       </w:r>
     </w:p>
-    <w:bookmarkStart w:id="39" w:name="Xcf51d3c8ebebbfdb01f8c673dab51edf8470383"/>
+    <w:bookmarkStart w:id="46" w:name="Xcf51d3c8ebebbfdb01f8c673dab51edf8470383"/>
     <w:p>
       <w:pPr>
         <w:pStyle w:val="Heading2"/>
@@ -1937,18 +2001,18 @@
           <wp:inline>
             <wp:extent cx="5334000" cy="3556000"/>
             <wp:effectExtent b="0" l="0" r="0" t="0"/>
-            <wp:docPr descr="Figure 2. Pollutant removal rates for three scenarios of BMP application: pasture BMPs, river BMPs, and combined BMPs.)" title="" id="37" name="Picture"/>
+            <wp:docPr descr="Figure 2. Pollutant removal rates for three scenarios of BMP application: pasture BMPs, river BMPs, and combined BMPs.)" title="" id="44" name="Picture"/>
             <a:graphic>
               <a:graphicData uri="http://schemas.openxmlformats.org/drawingml/2006/picture">
                 <pic:pic>
                   <pic:nvPicPr>
-                    <pic:cNvPr descr="02_PLET_Efficiencies.png" id="38" name="Picture"/>
+                    <pic:cNvPr descr="02_PLET_Efficiencies.png" id="45" name="Picture"/>
                     <pic:cNvPicPr>
                       <a:picLocks noChangeArrowheads="1" noChangeAspect="1"/>
                     </pic:cNvPicPr>
                   </pic:nvPicPr>
                   <pic:blipFill>
-                    <a:blip r:embed="rId36"/>
+                    <a:blip r:embed="rId43"/>
                     <a:stretch>
                       <a:fillRect/>
                     </a:stretch>
@@ -1983,8 +2047,8 @@
         <w:t xml:space="preserve">Figure 2. Pollutant removal rates for three scenarios of BMP application: pasture BMPs, river BMPs, and combined BMPs.)</w:t>
       </w:r>
     </w:p>
-    <w:bookmarkEnd w:id="39"/>
-    <w:bookmarkStart w:id="43" w:name="Xd49aff307bd93e1f0b935d6443699ce88163584"/>
+    <w:bookmarkEnd w:id="46"/>
+    <w:bookmarkStart w:id="50" w:name="Xd49aff307bd93e1f0b935d6443699ce88163584"/>
     <w:p>
       <w:pPr>
         <w:pStyle w:val="Heading2"/>
@@ -2046,18 +2110,18 @@
           <wp:inline>
             <wp:extent cx="5334000" cy="1859011"/>
             <wp:effectExtent b="0" l="0" r="0" t="0"/>
-            <wp:docPr descr="Figure 3. HSPF output for pollutant loads. All loads are expressed as median fluxes of daily load estimates over a simulation period. Sediment was simulated over the five year period from 2010-2015, and nutrients were simulated over the 11 years spanning 2013-2024." title="" id="41" name="Picture"/>
+            <wp:docPr descr="Figure 3. HSPF output for pollutant loads. All loads are expressed as median fluxes of daily load estimates over a simulation period. Sediment was simulated over the five year period from 2010-2015, and nutrients were simulated over the 11 years spanning 2013-2024." title="" id="48" name="Picture"/>
             <a:graphic>
               <a:graphicData uri="http://schemas.openxmlformats.org/drawingml/2006/picture">
                 <pic:pic>
                   <pic:nvPicPr>
-                    <pic:cNvPr descr="03_HSPF.Outputs.png" id="42" name="Picture"/>
+                    <pic:cNvPr descr="03_HSPF.Outputs.png" id="49" name="Picture"/>
                     <pic:cNvPicPr>
                       <a:picLocks noChangeArrowheads="1" noChangeAspect="1"/>
                     </pic:cNvPicPr>
                   </pic:nvPicPr>
                   <pic:blipFill>
-                    <a:blip r:embed="rId40"/>
+                    <a:blip r:embed="rId47"/>
                     <a:stretch>
                       <a:fillRect/>
                     </a:stretch>
@@ -2092,8 +2156,8 @@
         <w:t xml:space="preserve">Figure 3. HSPF output for pollutant loads. All loads are expressed as median fluxes of daily load estimates over a simulation period. Sediment was simulated over the five year period from 2010-2015, and nutrients were simulated over the 11 years spanning 2013-2024.</w:t>
       </w:r>
     </w:p>
-    <w:bookmarkEnd w:id="43"/>
-    <w:bookmarkStart w:id="47" w:name="X3d4771b2dcfa3b48338d1ad915ac9bd48785b3c"/>
+    <w:bookmarkEnd w:id="50"/>
+    <w:bookmarkStart w:id="54" w:name="X3d4771b2dcfa3b48338d1ad915ac9bd48785b3c"/>
     <w:p>
       <w:pPr>
         <w:pStyle w:val="Heading2"/>
@@ -2131,18 +2195,18 @@
           <wp:inline>
             <wp:extent cx="5334000" cy="5334000"/>
             <wp:effectExtent b="0" l="0" r="0" t="0"/>
-            <wp:docPr descr="Figure 4. Prioritization based on average ranking relative to water quality loads (TN, TP, Sediment) and feasibility (appraised land value, riparian buffers, and time of travel to Brewer Lake). Labels indicate catchment number." title="" id="45" name="Picture"/>
+            <wp:docPr descr="Figure 4. Prioritization based on average ranking relative to water quality loads (TN, TP, Sediment) and feasibility (appraised land value, riparian buffers, and time of travel to Brewer Lake). Labels indicate catchment number." title="" id="52" name="Picture"/>
             <a:graphic>
               <a:graphicData uri="http://schemas.openxmlformats.org/drawingml/2006/picture">
                 <pic:pic>
                   <pic:nvPicPr>
-                    <pic:cNvPr descr="04_Prioritization_Ranking.png" id="46" name="Picture"/>
+                    <pic:cNvPr descr="04_Prioritization_Ranking.png" id="53" name="Picture"/>
                     <pic:cNvPicPr>
                       <a:picLocks noChangeArrowheads="1" noChangeAspect="1"/>
                     </pic:cNvPicPr>
                   </pic:nvPicPr>
                   <pic:blipFill>
-                    <a:blip r:embed="rId44"/>
+                    <a:blip r:embed="rId51"/>
                     <a:stretch>
                       <a:fillRect/>
                     </a:stretch>
@@ -4556,8 +4620,8 @@
         <w:t xml:space="preserve">in the watershed. Catchments 9, 10, and 13 were also identified by the MCDA as technically important opportunities for managing pollutant loads in the central valley portions of the basin. Catchments 17, 22, and 25 were identified as key sites for BMPs given their proximity to Brewer Lake.</w:t>
       </w:r>
     </w:p>
-    <w:bookmarkEnd w:id="47"/>
-    <w:bookmarkStart w:id="51" w:name="X9589fee828a2009fe83519faf4055712b3ffe60"/>
+    <w:bookmarkEnd w:id="54"/>
+    <w:bookmarkStart w:id="58" w:name="X9589fee828a2009fe83519faf4055712b3ffe60"/>
     <w:p>
       <w:pPr>
         <w:pStyle w:val="Heading2"/>
@@ -4603,18 +4667,18 @@
           <wp:inline>
             <wp:extent cx="5334000" cy="7112000"/>
             <wp:effectExtent b="0" l="0" r="0" t="0"/>
-            <wp:docPr descr="Figure 5. Examination of the extent of BMPs required to meet watershed goals by only taking action in the eight (8) priority catchments. All three BMP scenarios can meet the 15% reduction target for nitrogen, phosphorous, and sediment by taking action only in the priority sub-catchments." title="" id="49" name="Picture"/>
+            <wp:docPr descr="Figure 5. Examination of the extent of BMPs required to meet watershed goals by only taking action in the eight (8) priority catchments. All three BMP scenarios can meet the 15% reduction target for nitrogen, phosphorous, and sediment by taking action only in the priority sub-catchments." title="" id="56" name="Picture"/>
             <a:graphic>
               <a:graphicData uri="http://schemas.openxmlformats.org/drawingml/2006/picture">
                 <pic:pic>
                   <pic:nvPicPr>
-                    <pic:cNvPr descr="05_PLET_PriorityCatchments.png" id="50" name="Picture"/>
+                    <pic:cNvPr descr="05_PLET_PriorityCatchments.png" id="57" name="Picture"/>
                     <pic:cNvPicPr>
                       <a:picLocks noChangeArrowheads="1" noChangeAspect="1"/>
                     </pic:cNvPicPr>
                   </pic:nvPicPr>
                   <pic:blipFill>
-                    <a:blip r:embed="rId48"/>
+                    <a:blip r:embed="rId55"/>
                     <a:stretch>
                       <a:fillRect/>
                     </a:stretch>
@@ -4649,9 +4713,9 @@
         <w:t xml:space="preserve">Figure 5. Examination of the extent of BMPs required to meet watershed goals by only taking action in the eight (8) priority catchments. All three BMP scenarios can meet the 15% reduction target for nitrogen, phosphorous, and sediment by taking action only in the priority sub-catchments.</w:t>
       </w:r>
     </w:p>
-    <w:bookmarkEnd w:id="51"/>
-    <w:bookmarkEnd w:id="52"/>
-    <w:bookmarkStart w:id="53" w:name="discussion"/>
+    <w:bookmarkEnd w:id="58"/>
+    <w:bookmarkEnd w:id="59"/>
+    <w:bookmarkStart w:id="60" w:name="discussion"/>
     <w:p>
       <w:pPr>
         <w:pStyle w:val="Heading1"/>
@@ -4708,8 +4772,8 @@
         <w:t xml:space="preserve">Ultimately, the Brewer Lake watershed study merged existing watershed planning and decision analysis processes with questions and constraints identified by local stakeholders and managers. The study provided discrete but non-prescriptive priorities that can guide management choices toward specific parts of the watershed and families of BMPs. However, analysis is one component of watershed management (Montgomery et al. 1995), and subsequent actions will be needed for co-producing BMPs with stakeholders, site-scale design, project implementation, monitoring, and long-term operations and maintenance. The temporal scale of watershed planning is long-term, and this study sought to arm decision makers with the priorities to guide the next steps in the long arc of multi-generational watershed management.</w:t>
       </w:r>
     </w:p>
-    <w:bookmarkEnd w:id="53"/>
-    <w:bookmarkStart w:id="55" w:name="acknowledgements"/>
+    <w:bookmarkEnd w:id="60"/>
+    <w:bookmarkStart w:id="62" w:name="acknowledgements"/>
     <w:p>
       <w:pPr>
         <w:pStyle w:val="Heading1"/>
@@ -4727,12 +4791,12 @@
         <w:pStyle w:val="FirstParagraph"/>
       </w:pPr>
       <w:r>
-        <w:t xml:space="preserve">This project was supported by the Tulsa District of the U.S. Army Corps of Engineers (USACE) and the Conway Corporation, under the direction of Sarah Austin, USACE’s Project Manager. Other agencies and organizations advised on the development of the watershed management plan, including the US Department of Agriculture, Conway County Regional Water Distribution District, and the Arkansas Department of Agriculture. Additionally, watershed residents and stakeholders provided input through a series of public meetings, and their input is gratefully acknowledged. This paper presents parts of the overall watershed study, and the results do not necessarily represent the outcomes of the USACE project planning process, which are available from the</w:t>
+        <w:t xml:space="preserve">This project was performed for the Tulsa District of the U.S. Army Corps of Engineers (USACE) and the Conway Corporation. Other agencies and organizations advised on the development of the watershed management plan, including the US Department of Agriculture, Conway County Regional Water Distribution District, and the Arkansas Department of Agriculture. Additionally, watershed residents and stakeholders provided input through a series of public meetings, and their input is gratefully acknowledged. This paper presents parts of the overall watershed study, and the results do not necessarily represent the outcomes of the USACE project planning process, which are available from the</w:t>
       </w:r>
       <w:r>
         <w:t xml:space="preserve"> </w:t>
       </w:r>
-      <w:hyperlink r:id="rId54">
+      <w:hyperlink r:id="rId61">
         <w:r>
           <w:rPr>
             <w:rStyle w:val="Hyperlink"/>
@@ -4744,8 +4808,8 @@
         <w:t xml:space="preserve">. The opinions expressed here are those of the authors and not necessarily those of the USACE, Conway Corporation, Woolpert, or Black &amp; Veatch.</w:t>
       </w:r>
     </w:p>
-    <w:bookmarkEnd w:id="55"/>
-    <w:bookmarkStart w:id="56" w:name="author-contributions"/>
+    <w:bookmarkEnd w:id="62"/>
+    <w:bookmarkStart w:id="63" w:name="author-contributions"/>
     <w:p>
       <w:pPr>
         <w:pStyle w:val="Heading1"/>
@@ -4766,8 +4830,8 @@
         <w:t xml:space="preserve">Conceptualization, M.L., J.H., and S.K.M.; Methodology, M.B., J.R., and S.K.M.; Formal Analysis, J.H., D.A., M.B., J.R., and S.K.M.; ; Resources, M.L. and D.A.; Writing – Original Draft Preparation, M.B., J.H., and S.K.M.; Writing – Review &amp; Editing, M.L., J.H., D.A., M.B., J.H., and S.K.M.; Supervision, M.L.; Project Administration, M.L., J.H., and D.A.; Funding Acquisition, M.L. and D.A.”</w:t>
       </w:r>
     </w:p>
-    <w:bookmarkEnd w:id="56"/>
-    <w:bookmarkStart w:id="59" w:name="references"/>
+    <w:bookmarkEnd w:id="63"/>
+    <w:bookmarkStart w:id="66" w:name="references"/>
     <w:p>
       <w:pPr>
         <w:pStyle w:val="Heading1"/>
@@ -4846,7 +4910,7 @@
       <w:r>
         <w:t xml:space="preserve"> </w:t>
       </w:r>
-      <w:hyperlink r:id="rId57">
+      <w:hyperlink r:id="rId64">
         <w:r>
           <w:rPr>
             <w:rStyle w:val="Hyperlink"/>
@@ -4924,7 +4988,7 @@
       <w:r>
         <w:t xml:space="preserve"> </w:t>
       </w:r>
-      <w:hyperlink r:id="rId58">
+      <w:hyperlink r:id="rId65">
         <w:r>
           <w:rPr>
             <w:rStyle w:val="Hyperlink"/>
@@ -5104,7 +5168,7 @@
         <w:t xml:space="preserve">Zhang, Q., Blomquist, J.D., Fanelli, R.M., Keisman, J.L., Moyer, D.L. and Langland, M.J., 2023. Progress in reducing nutrient and sediment loads to Chesapeake Bay: Three decades of monitoring data and implications for restoring complex ecosystems. Wiley Interdisciplinary Reviews: Water, 10(5), p.e1671.</w:t>
       </w:r>
     </w:p>
-    <w:bookmarkEnd w:id="59"/>
+    <w:bookmarkEnd w:id="66"/>
     <w:sectPr/>
   </w:body>
 </w:document>
@@ -5321,9 +5385,6 @@
     <w:abstractNumId w:val="991"/>
   </w:num>
   <w:num w:numId="1002">
-    <w:abstractNumId w:val="991"/>
-  </w:num>
-  <w:num w:numId="1003">
     <w:abstractNumId w:val="991"/>
   </w:num>
 </w:numbering>

</xml_diff>